<commit_message>
docs(AASP01): atualiza documentos MPS-SW v&v, gco, med, rastr, indice (23/06/2026)
</commit_message>
<xml_diff>
--- a/mps-nivel-c/oficial/04_registros/AASP_Gerenciador/AASP01_Grupos-Usuarios/00_INDICE-AASP01_Mapa-de-Registros.docx
+++ b/mps-nivel-c/oficial/04_registros/AASP_Gerenciador/AASP01_Grupos-Usuarios/00_INDICE-AASP01_Mapa-de-Registros.docx
@@ -34,7 +34,7 @@
           <w:color w:val="555555"/>
           <w:sz w:val="20"/>
         </w:rPr>
-        <w:t>AASP01   ·   Versão 1.0   ·   15/06/2026   ·   Timeware Brasil</w:t>
+        <w:t>INDICE-AASP01   ·   Versão 1.1   ·   23/06/2026   ·   Timeware Brasil</w:t>
       </w:r>
     </w:p>
     <w:p>
@@ -48,7 +48,6 @@
     <w:tbl>
       <w:tblPr>
         <w:tblW w:type="auto" w:w="0"/>
-        <w:tblLook w:firstColumn="1" w:firstRow="1" w:lastColumn="0" w:lastRow="0" w:noHBand="0" w:noVBand="1" w:val="04A0"/>
         <w:tblBorders>
           <w:top w:val="single" w:sz="4" w:space="0" w:color="AAAAAA"/>
           <w:left w:val="single" w:sz="4" w:space="0" w:color="AAAAAA"/>
@@ -145,7 +144,63 @@
                 <w:i w:val="0"/>
                 <w:sz w:val="20"/>
               </w:rPr>
-              <w:t>Documento</w:t>
+              <w:t xml:space="preserve">Documento</w:t>
+            </w:r>
+          </w:p>
+        </w:tc>
+        <w:tc>
+          <w:tcPr>
+            <w:tcW w:type="dxa" w:w="4451"/>
+            <w:tcMar>
+              <w:top w:w="60" w:type="dxa"/>
+              <w:bottom w:w="60" w:type="dxa"/>
+              <w:left w:w="100" w:type="dxa"/>
+              <w:right w:w="100" w:type="dxa"/>
+            </w:tcMar>
+            <w:shd w:val="clear" w:color="auto" w:fill="F0F4F8"/>
+          </w:tcPr>
+          <w:p>
+            <w:pPr>
+              <w:spacing w:before="40" w:after="40"/>
+            </w:pPr>
+            <w:r>
+              <w:rPr>
+                <w:rFonts w:ascii="Calibri" w:hAnsi="Calibri"/>
+                <w:b w:val="0"/>
+                <w:i w:val="0"/>
+                <w:sz w:val="20"/>
+              </w:rPr>
+              <w:t xml:space="preserve">INDICE-AASP01-001</w:t>
+            </w:r>
+          </w:p>
+        </w:tc>
+      </w:tr>
+      <w:tr>
+        <w:trPr>
+          <w:cantSplit w:val="1"/>
+        </w:trPr>
+        <w:tc>
+          <w:tcPr>
+            <w:tcW w:type="dxa" w:w="4451"/>
+            <w:tcMar>
+              <w:top w:w="60" w:type="dxa"/>
+              <w:bottom w:w="60" w:type="dxa"/>
+              <w:left w:w="100" w:type="dxa"/>
+              <w:right w:w="100" w:type="dxa"/>
+            </w:tcMar>
+          </w:tcPr>
+          <w:p>
+            <w:pPr>
+              <w:spacing w:before="40" w:after="40"/>
+            </w:pPr>
+            <w:r>
+              <w:rPr>
+                <w:rFonts w:ascii="Calibri" w:hAnsi="Calibri"/>
+                <w:b/>
+                <w:i w:val="0"/>
+                <w:sz w:val="20"/>
+              </w:rPr>
+              <w:t xml:space="preserve">Projeto</w:t>
             </w:r>
           </w:p>
         </w:tc>
@@ -170,7 +225,7 @@
                 <w:i w:val="0"/>
                 <w:sz w:val="20"/>
               </w:rPr>
-              <w:t>INDICE-AASP01-001</w:t>
+              <w:t xml:space="preserve">Grupos de Usuários — AASP Gerenciador (Feature AG)</w:t>
             </w:r>
           </w:p>
         </w:tc>
@@ -201,7 +256,63 @@
                 <w:i w:val="0"/>
                 <w:sz w:val="20"/>
               </w:rPr>
-              <w:t>Projeto</w:t>
+              <w:t xml:space="preserve">Código do projeto</w:t>
+            </w:r>
+          </w:p>
+        </w:tc>
+        <w:tc>
+          <w:tcPr>
+            <w:tcW w:type="dxa" w:w="4451"/>
+            <w:tcMar>
+              <w:top w:w="60" w:type="dxa"/>
+              <w:bottom w:w="60" w:type="dxa"/>
+              <w:left w:w="100" w:type="dxa"/>
+              <w:right w:w="100" w:type="dxa"/>
+            </w:tcMar>
+            <w:shd w:val="clear" w:color="auto" w:fill="F0F4F8"/>
+          </w:tcPr>
+          <w:p>
+            <w:pPr>
+              <w:spacing w:before="40" w:after="40"/>
+            </w:pPr>
+            <w:r>
+              <w:rPr>
+                <w:rFonts w:ascii="Calibri" w:hAnsi="Calibri"/>
+                <w:b w:val="0"/>
+                <w:i w:val="0"/>
+                <w:sz w:val="20"/>
+              </w:rPr>
+              <w:t xml:space="preserve">AASP01</w:t>
+            </w:r>
+          </w:p>
+        </w:tc>
+      </w:tr>
+      <w:tr>
+        <w:trPr>
+          <w:cantSplit w:val="1"/>
+        </w:trPr>
+        <w:tc>
+          <w:tcPr>
+            <w:tcW w:type="dxa" w:w="4451"/>
+            <w:tcMar>
+              <w:top w:w="60" w:type="dxa"/>
+              <w:bottom w:w="60" w:type="dxa"/>
+              <w:left w:w="100" w:type="dxa"/>
+              <w:right w:w="100" w:type="dxa"/>
+            </w:tcMar>
+          </w:tcPr>
+          <w:p>
+            <w:pPr>
+              <w:spacing w:before="40" w:after="40"/>
+            </w:pPr>
+            <w:r>
+              <w:rPr>
+                <w:rFonts w:ascii="Calibri" w:hAnsi="Calibri"/>
+                <w:b/>
+                <w:i w:val="0"/>
+                <w:sz w:val="20"/>
+              </w:rPr>
+              <w:t xml:space="preserve">Cliente</w:t>
             </w:r>
           </w:p>
         </w:tc>
@@ -226,7 +337,7 @@
                 <w:i w:val="0"/>
                 <w:sz w:val="20"/>
               </w:rPr>
-              <w:t>Grupos de Usuários — AASP Gerenciador (Feature AG)</w:t>
+              <w:t xml:space="preserve">AASP — Associação dos Advogados de São Paulo</w:t>
             </w:r>
           </w:p>
         </w:tc>
@@ -257,7 +368,63 @@
                 <w:i w:val="0"/>
                 <w:sz w:val="20"/>
               </w:rPr>
-              <w:t>Código do projeto</w:t>
+              <w:t xml:space="preserve">Produto</w:t>
+            </w:r>
+          </w:p>
+        </w:tc>
+        <w:tc>
+          <w:tcPr>
+            <w:tcW w:type="dxa" w:w="4451"/>
+            <w:tcMar>
+              <w:top w:w="60" w:type="dxa"/>
+              <w:bottom w:w="60" w:type="dxa"/>
+              <w:left w:w="100" w:type="dxa"/>
+              <w:right w:w="100" w:type="dxa"/>
+            </w:tcMar>
+            <w:shd w:val="clear" w:color="auto" w:fill="F0F4F8"/>
+          </w:tcPr>
+          <w:p>
+            <w:pPr>
+              <w:spacing w:before="40" w:after="40"/>
+            </w:pPr>
+            <w:r>
+              <w:rPr>
+                <w:rFonts w:ascii="Calibri" w:hAnsi="Calibri"/>
+                <w:b w:val="0"/>
+                <w:i w:val="0"/>
+                <w:sz w:val="20"/>
+              </w:rPr>
+              <w:t xml:space="preserve">ms.auxo.gruposusuarios</w:t>
+            </w:r>
+          </w:p>
+        </w:tc>
+      </w:tr>
+      <w:tr>
+        <w:trPr>
+          <w:cantSplit w:val="1"/>
+        </w:trPr>
+        <w:tc>
+          <w:tcPr>
+            <w:tcW w:type="dxa" w:w="4451"/>
+            <w:tcMar>
+              <w:top w:w="60" w:type="dxa"/>
+              <w:bottom w:w="60" w:type="dxa"/>
+              <w:left w:w="100" w:type="dxa"/>
+              <w:right w:w="100" w:type="dxa"/>
+            </w:tcMar>
+          </w:tcPr>
+          <w:p>
+            <w:pPr>
+              <w:spacing w:before="40" w:after="40"/>
+            </w:pPr>
+            <w:r>
+              <w:rPr>
+                <w:rFonts w:ascii="Calibri" w:hAnsi="Calibri"/>
+                <w:b/>
+                <w:i w:val="0"/>
+                <w:sz w:val="20"/>
+              </w:rPr>
+              <w:t xml:space="preserve">Versão</w:t>
             </w:r>
           </w:p>
         </w:tc>
@@ -282,7 +449,7 @@
                 <w:i w:val="0"/>
                 <w:sz w:val="20"/>
               </w:rPr>
-              <w:t>AASP01</w:t>
+              <w:t xml:space="preserve">1.1</w:t>
             </w:r>
           </w:p>
         </w:tc>
@@ -313,7 +480,63 @@
                 <w:i w:val="0"/>
                 <w:sz w:val="20"/>
               </w:rPr>
-              <w:t>Cliente</w:t>
+              <w:t xml:space="preserve">Data</w:t>
+            </w:r>
+          </w:p>
+        </w:tc>
+        <w:tc>
+          <w:tcPr>
+            <w:tcW w:type="dxa" w:w="4451"/>
+            <w:tcMar>
+              <w:top w:w="60" w:type="dxa"/>
+              <w:bottom w:w="60" w:type="dxa"/>
+              <w:left w:w="100" w:type="dxa"/>
+              <w:right w:w="100" w:type="dxa"/>
+            </w:tcMar>
+            <w:shd w:val="clear" w:color="auto" w:fill="F0F4F8"/>
+          </w:tcPr>
+          <w:p>
+            <w:pPr>
+              <w:spacing w:before="40" w:after="40"/>
+            </w:pPr>
+            <w:r>
+              <w:rPr>
+                <w:rFonts w:ascii="Calibri" w:hAnsi="Calibri"/>
+                <w:b w:val="0"/>
+                <w:i w:val="0"/>
+                <w:sz w:val="20"/>
+              </w:rPr>
+              <w:t xml:space="preserve">23/06/2026</w:t>
+            </w:r>
+          </w:p>
+        </w:tc>
+      </w:tr>
+      <w:tr>
+        <w:trPr>
+          <w:cantSplit w:val="1"/>
+        </w:trPr>
+        <w:tc>
+          <w:tcPr>
+            <w:tcW w:type="dxa" w:w="4451"/>
+            <w:tcMar>
+              <w:top w:w="60" w:type="dxa"/>
+              <w:bottom w:w="60" w:type="dxa"/>
+              <w:left w:w="100" w:type="dxa"/>
+              <w:right w:w="100" w:type="dxa"/>
+            </w:tcMar>
+          </w:tcPr>
+          <w:p>
+            <w:pPr>
+              <w:spacing w:before="40" w:after="40"/>
+            </w:pPr>
+            <w:r>
+              <w:rPr>
+                <w:rFonts w:ascii="Calibri" w:hAnsi="Calibri"/>
+                <w:b/>
+                <w:i w:val="0"/>
+                <w:sz w:val="20"/>
+              </w:rPr>
+              <w:t xml:space="preserve">Natureza</w:t>
             </w:r>
           </w:p>
         </w:tc>
@@ -338,25 +561,168 @@
                 <w:i w:val="0"/>
                 <w:sz w:val="20"/>
               </w:rPr>
-              <w:t>AASP — Associação dos Advogados de São Paulo</w:t>
+              <w:t xml:space="preserve">Documento de controle / índice — apoio interno. Organiza a produção das evidências do projeto; não é, ele próprio, evidência auditável pela ASR.</w:t>
             </w:r>
           </w:p>
         </w:tc>
       </w:tr>
+    </w:tbl>
+    <w:p>
+      <w:pPr>
+        <w:spacing w:before="120" w:after="120"/>
+      </w:pPr>
+    </w:p>
+    <w:p>
+      <w:pPr>
+        <w:spacing w:before="80" w:after="80"/>
+        <w:ind w:left="720"/>
+      </w:pPr>
+      <w:r>
+        <w:rPr>
+          <w:rFonts w:ascii="Calibri" w:hAnsi="Calibri"/>
+          <w:i/>
+          <w:color w:val="555555"/>
+          <w:sz w:val="20"/>
+        </w:rPr>
+        <w:t xml:space="preserve">Como usar: este índice mapeia os registros MPS-SW do projeto AASP01, o processo de origem e o status de cada um. Conforme cada artefato evolui, atualizar a coluna Status e registrar no histórico ao final.</w:t>
+      </w:r>
+    </w:p>
+    <w:p>
+      <w:pPr>
+        <w:pStyle w:val="Heading2"/>
+      </w:pPr>
+      <w:r>
+        <w:rPr>
+          <w:rFonts w:ascii="Calibri" w:hAnsi="Calibri"/>
+        </w:rPr>
+        <w:t>1. Contexto e Momento do Projeto</w:t>
+      </w:r>
+    </w:p>
+    <w:p>
+      <w:pPr>
+        <w:pStyle w:val="ListParagraph"/>
+        <w:numPr>
+          <w:ilvl w:val="0"/>
+          <w:numId w:val="1"/>
+        </w:numPr>
+        <w:ind w:left="720" w:hanging="360"/>
+      </w:pPr>
+      <w:r>
+        <w:rPr>
+          <w:rFonts w:ascii="Calibri" w:hAnsi="Calibri"/>
+          <w:sz w:val="20"/>
+        </w:rPr>
+        <w:t xml:space="preserve">Início: 19/05/2026 (Kickoff) · Encerramento previsto: 11/07/2026</w:t>
+      </w:r>
+    </w:p>
+    <w:p>
+      <w:pPr>
+        <w:pStyle w:val="ListParagraph"/>
+        <w:numPr>
+          <w:ilvl w:val="0"/>
+          <w:numId w:val="1"/>
+        </w:numPr>
+        <w:ind w:left="720" w:hanging="360"/>
+      </w:pPr>
+      <w:r>
+        <w:rPr>
+          <w:rFonts w:ascii="Calibri" w:hAnsi="Calibri"/>
+          <w:sz w:val="20"/>
+        </w:rPr>
+        <w:t xml:space="preserve">Status atual (23/06/2026): em execução — Sprint 1 concluída e aceita (06/06/2026); Sprint 2 em andamento; Sprint 3 planejada.</w:t>
+      </w:r>
+    </w:p>
+    <w:p>
+      <w:pPr>
+        <w:pStyle w:val="ListParagraph"/>
+        <w:numPr>
+          <w:ilvl w:val="0"/>
+          <w:numId w:val="1"/>
+        </w:numPr>
+        <w:ind w:left="720" w:hanging="360"/>
+      </w:pPr>
+      <w:r>
+        <w:rPr>
+          <w:rFonts w:ascii="Calibri" w:hAnsi="Calibri"/>
+          <w:sz w:val="20"/>
+        </w:rPr>
+        <w:t xml:space="preserve">Nível de adaptação: 2 — Padrão (ver ADAP-AASP01-001).</w:t>
+      </w:r>
+    </w:p>
+    <w:p>
+      <w:pPr>
+        <w:pStyle w:val="ListParagraph"/>
+        <w:numPr>
+          <w:ilvl w:val="0"/>
+          <w:numId w:val="1"/>
+        </w:numPr>
+        <w:ind w:left="720" w:hanging="360"/>
+      </w:pPr>
+      <w:r>
+        <w:rPr>
+          <w:rFonts w:ascii="Calibri" w:hAnsi="Calibri"/>
+          <w:sz w:val="20"/>
+        </w:rPr>
+        <w:t xml:space="preserve">Fases do processo-padrão (PRO-GPC-001): Abertura, Discovery/Requisitos, Concepção e Planejamento concluídas; Desenvolvimento em curso; Homologação e Encerramento previstos para a Sprint 3.</w:t>
+      </w:r>
+    </w:p>
+    <w:p>
+      <w:pPr>
+        <w:pStyle w:val="Heading2"/>
+      </w:pPr>
+      <w:r>
+        <w:rPr>
+          <w:rFonts w:ascii="Calibri" w:hAnsi="Calibri"/>
+        </w:rPr>
+        <w:t>2. Registros do Projeto</w:t>
+      </w:r>
+    </w:p>
+    <w:p>
+      <w:pPr>
+        <w:spacing w:before="80" w:after="80"/>
+      </w:pPr>
+      <w:r>
+        <w:rPr>
+          <w:rFonts w:ascii="Calibri" w:hAnsi="Calibri"/>
+          <w:sz w:val="20"/>
+        </w:rPr>
+        <w:t xml:space="preserve">Legenda de status: gerado e no repositório · previsto (encerramento).</w:t>
+      </w:r>
+    </w:p>
+    <w:tbl>
+      <w:tblPr>
+        <w:tblW w:type="auto" w:w="0"/>
+        <w:tblBorders>
+          <w:top w:val="single" w:sz="4" w:space="0" w:color="AAAAAA"/>
+          <w:left w:val="single" w:sz="4" w:space="0" w:color="AAAAAA"/>
+          <w:bottom w:val="single" w:sz="4" w:space="0" w:color="AAAAAA"/>
+          <w:right w:val="single" w:sz="4" w:space="0" w:color="AAAAAA"/>
+          <w:insideH w:val="single" w:sz="4" w:space="0" w:color="AAAAAA"/>
+          <w:insideV w:val="single" w:sz="4" w:space="0" w:color="AAAAAA"/>
+        </w:tblBorders>
+      </w:tblPr>
+      <w:tblGrid>
+        <w:gridCol w:w="1780"/>
+        <w:gridCol w:w="1780"/>
+        <w:gridCol w:w="1780"/>
+        <w:gridCol w:w="1780"/>
+        <w:gridCol w:w="1782"/>
+      </w:tblGrid>
       <w:tr>
         <w:trPr>
+          <w:tblHeader/>
           <w:cantSplit w:val="1"/>
         </w:trPr>
         <w:tc>
           <w:tcPr>
-            <w:tcW w:type="dxa" w:w="4451"/>
+            <w:tcW w:type="dxa" w:w="1780"/>
             <w:tcMar>
               <w:top w:w="60" w:type="dxa"/>
               <w:bottom w:w="60" w:type="dxa"/>
-              <w:left w:w="100" w:type="dxa"/>
-              <w:right w:w="100" w:type="dxa"/>
+              <w:left w:w="80" w:type="dxa"/>
+              <w:right w:w="80" w:type="dxa"/>
             </w:tcMar>
-            <w:shd w:val="clear" w:color="auto" w:fill="F0F4F8"/>
+            <w:shd w:val="clear" w:color="auto" w:fill="1F3864"/>
           </w:tcPr>
           <w:p>
             <w:pPr>
@@ -366,53 +732,23 @@
               <w:rPr>
                 <w:rFonts w:ascii="Calibri" w:hAnsi="Calibri"/>
                 <w:b/>
-                <w:i w:val="0"/>
+                <w:color w:val="FFFFFF"/>
                 <w:sz w:val="20"/>
               </w:rPr>
-              <w:t>Produto</w:t>
+              <w:t xml:space="preserve">#</w:t>
             </w:r>
           </w:p>
         </w:tc>
         <w:tc>
           <w:tcPr>
-            <w:tcW w:type="dxa" w:w="4451"/>
+            <w:tcW w:type="dxa" w:w="1780"/>
             <w:tcMar>
               <w:top w:w="60" w:type="dxa"/>
               <w:bottom w:w="60" w:type="dxa"/>
-              <w:left w:w="100" w:type="dxa"/>
-              <w:right w:w="100" w:type="dxa"/>
+              <w:left w:w="80" w:type="dxa"/>
+              <w:right w:w="80" w:type="dxa"/>
             </w:tcMar>
-          </w:tcPr>
-          <w:p>
-            <w:pPr>
-              <w:spacing w:before="40" w:after="40"/>
-            </w:pPr>
-            <w:r>
-              <w:rPr>
-                <w:rFonts w:ascii="Calibri" w:hAnsi="Calibri"/>
-                <w:b w:val="0"/>
-                <w:i w:val="0"/>
-                <w:sz w:val="20"/>
-              </w:rPr>
-              <w:t>ms.auxo.gruposusuarios</w:t>
-            </w:r>
-          </w:p>
-        </w:tc>
-      </w:tr>
-      <w:tr>
-        <w:trPr>
-          <w:cantSplit w:val="1"/>
-        </w:trPr>
-        <w:tc>
-          <w:tcPr>
-            <w:tcW w:type="dxa" w:w="4451"/>
-            <w:tcMar>
-              <w:top w:w="60" w:type="dxa"/>
-              <w:bottom w:w="60" w:type="dxa"/>
-              <w:left w:w="100" w:type="dxa"/>
-              <w:right w:w="100" w:type="dxa"/>
-            </w:tcMar>
-            <w:shd w:val="clear" w:color="auto" w:fill="F0F4F8"/>
+            <w:shd w:val="clear" w:color="auto" w:fill="1F3864"/>
           </w:tcPr>
           <w:p>
             <w:pPr>
@@ -422,53 +758,23 @@
               <w:rPr>
                 <w:rFonts w:ascii="Calibri" w:hAnsi="Calibri"/>
                 <w:b/>
-                <w:i w:val="0"/>
+                <w:color w:val="FFFFFF"/>
                 <w:sz w:val="20"/>
               </w:rPr>
-              <w:t>Versão</w:t>
+              <w:t xml:space="preserve">Código</w:t>
             </w:r>
           </w:p>
         </w:tc>
         <w:tc>
           <w:tcPr>
-            <w:tcW w:type="dxa" w:w="4451"/>
+            <w:tcW w:type="dxa" w:w="1780"/>
             <w:tcMar>
               <w:top w:w="60" w:type="dxa"/>
               <w:bottom w:w="60" w:type="dxa"/>
-              <w:left w:w="100" w:type="dxa"/>
-              <w:right w:w="100" w:type="dxa"/>
+              <w:left w:w="80" w:type="dxa"/>
+              <w:right w:w="80" w:type="dxa"/>
             </w:tcMar>
-          </w:tcPr>
-          <w:p>
-            <w:pPr>
-              <w:spacing w:before="40" w:after="40"/>
-            </w:pPr>
-            <w:r>
-              <w:rPr>
-                <w:rFonts w:ascii="Calibri" w:hAnsi="Calibri"/>
-                <w:b w:val="0"/>
-                <w:i w:val="0"/>
-                <w:sz w:val="20"/>
-              </w:rPr>
-              <w:t>1.0</w:t>
-            </w:r>
-          </w:p>
-        </w:tc>
-      </w:tr>
-      <w:tr>
-        <w:trPr>
-          <w:cantSplit w:val="1"/>
-        </w:trPr>
-        <w:tc>
-          <w:tcPr>
-            <w:tcW w:type="dxa" w:w="4451"/>
-            <w:tcMar>
-              <w:top w:w="60" w:type="dxa"/>
-              <w:bottom w:w="60" w:type="dxa"/>
-              <w:left w:w="100" w:type="dxa"/>
-              <w:right w:w="100" w:type="dxa"/>
-            </w:tcMar>
-            <w:shd w:val="clear" w:color="auto" w:fill="F0F4F8"/>
+            <w:shd w:val="clear" w:color="auto" w:fill="1F3864"/>
           </w:tcPr>
           <w:p>
             <w:pPr>
@@ -478,53 +784,23 @@
               <w:rPr>
                 <w:rFonts w:ascii="Calibri" w:hAnsi="Calibri"/>
                 <w:b/>
-                <w:i w:val="0"/>
+                <w:color w:val="FFFFFF"/>
                 <w:sz w:val="20"/>
               </w:rPr>
-              <w:t>Data</w:t>
+              <w:t xml:space="preserve">Documento</w:t>
             </w:r>
           </w:p>
         </w:tc>
         <w:tc>
           <w:tcPr>
-            <w:tcW w:type="dxa" w:w="4451"/>
+            <w:tcW w:type="dxa" w:w="1780"/>
             <w:tcMar>
               <w:top w:w="60" w:type="dxa"/>
               <w:bottom w:w="60" w:type="dxa"/>
-              <w:left w:w="100" w:type="dxa"/>
-              <w:right w:w="100" w:type="dxa"/>
+              <w:left w:w="80" w:type="dxa"/>
+              <w:right w:w="80" w:type="dxa"/>
             </w:tcMar>
-          </w:tcPr>
-          <w:p>
-            <w:pPr>
-              <w:spacing w:before="40" w:after="40"/>
-            </w:pPr>
-            <w:r>
-              <w:rPr>
-                <w:rFonts w:ascii="Calibri" w:hAnsi="Calibri"/>
-                <w:b w:val="0"/>
-                <w:i w:val="0"/>
-                <w:sz w:val="20"/>
-              </w:rPr>
-              <w:t>15/06/2026</w:t>
-            </w:r>
-          </w:p>
-        </w:tc>
-      </w:tr>
-      <w:tr>
-        <w:trPr>
-          <w:cantSplit w:val="1"/>
-        </w:trPr>
-        <w:tc>
-          <w:tcPr>
-            <w:tcW w:type="dxa" w:w="4451"/>
-            <w:tcMar>
-              <w:top w:w="60" w:type="dxa"/>
-              <w:bottom w:w="60" w:type="dxa"/>
-              <w:left w:w="100" w:type="dxa"/>
-              <w:right w:w="100" w:type="dxa"/>
-            </w:tcMar>
-            <w:shd w:val="clear" w:color="auto" w:fill="F0F4F8"/>
+            <w:shd w:val="clear" w:color="auto" w:fill="1F3864"/>
           </w:tcPr>
           <w:p>
             <w:pPr>
@@ -534,291 +810,23 @@
               <w:rPr>
                 <w:rFonts w:ascii="Calibri" w:hAnsi="Calibri"/>
                 <w:b/>
-                <w:i w:val="0"/>
+                <w:color w:val="FFFFFF"/>
                 <w:sz w:val="20"/>
               </w:rPr>
-              <w:t>Natureza</w:t>
+              <w:t xml:space="preserve">Processo</w:t>
             </w:r>
           </w:p>
         </w:tc>
         <w:tc>
           <w:tcPr>
-            <w:tcW w:type="dxa" w:w="4451"/>
+            <w:tcW w:type="dxa" w:w="1782"/>
             <w:tcMar>
               <w:top w:w="60" w:type="dxa"/>
               <w:bottom w:w="60" w:type="dxa"/>
-              <w:left w:w="100" w:type="dxa"/>
-              <w:right w:w="100" w:type="dxa"/>
+              <w:left w:w="80" w:type="dxa"/>
+              <w:right w:w="80" w:type="dxa"/>
             </w:tcMar>
-          </w:tcPr>
-          <w:p>
-            <w:pPr>
-              <w:spacing w:before="40" w:after="40"/>
-            </w:pPr>
-            <w:r>
-              <w:rPr>
-                <w:rFonts w:ascii="Calibri" w:hAnsi="Calibri"/>
-                <w:b w:val="0"/>
-                <w:i w:val="0"/>
-                <w:sz w:val="20"/>
-              </w:rPr>
-              <w:t>Documento de controle / índice — apoio interno. Organiza a produção das evidências do projeto; não é, ele próprio, evidência auditável pela ASR.</w:t>
-            </w:r>
-          </w:p>
-        </w:tc>
-      </w:tr>
-    </w:tbl>
-    <w:p>
-      <w:pPr>
-        <w:spacing w:before="0" w:after="160"/>
-      </w:pPr>
-    </w:p>
-    <w:p>
-      <w:pPr>
-        <w:spacing w:before="40" w:after="120"/>
-        <w:ind w:left="454"/>
-        <w:pBdr>
-          <w:left w:val="single" w:sz="12" w:space="8" w:color="003366"/>
-        </w:pBdr>
-      </w:pPr>
-      <w:r>
-        <w:rPr>
-          <w:rFonts w:ascii="Calibri" w:hAnsi="Calibri"/>
-          <w:b/>
-          <w:i w:val="0"/>
-          <w:color w:val="1A5276"/>
-          <w:sz w:val="22"/>
-        </w:rPr>
-        <w:t>Como usar:</w:t>
-      </w:r>
-      <w:r>
-        <w:rPr>
-          <w:rFonts w:ascii="Calibri" w:hAnsi="Calibri"/>
-          <w:b w:val="0"/>
-          <w:i w:val="0"/>
-          <w:color w:val="1A5276"/>
-          <w:sz w:val="22"/>
-        </w:rPr>
-        <w:t xml:space="preserve"> este índice mapeia os registros MPS-SW do projeto AASP01, o processo de origem e o status de cada um. Conforme cada artefato evolui, atualizar a coluna </w:t>
-      </w:r>
-      <w:r>
-        <w:rPr>
-          <w:rFonts w:ascii="Calibri" w:hAnsi="Calibri"/>
-          <w:b/>
-          <w:i w:val="0"/>
-          <w:color w:val="1A5276"/>
-          <w:sz w:val="22"/>
-        </w:rPr>
-        <w:t>Status</w:t>
-      </w:r>
-      <w:r>
-        <w:rPr>
-          <w:rFonts w:ascii="Calibri" w:hAnsi="Calibri"/>
-          <w:b w:val="0"/>
-          <w:i w:val="0"/>
-          <w:color w:val="1A5276"/>
-          <w:sz w:val="22"/>
-        </w:rPr>
-        <w:t xml:space="preserve"> e registrar no histórico ao final.</w:t>
-      </w:r>
-    </w:p>
-    <w:p>
-      <w:pPr>
-        <w:pStyle w:val="Heading1"/>
-        <w:keepNext/>
-        <w:keepLines/>
-        <w:pBdr>
-          <w:bottom w:val="single" w:sz="4" w:space="2" w:color="D6E4F0"/>
-        </w:pBdr>
-      </w:pPr>
-      <w:r>
-        <w:t>1. Contexto e momento do projeto</w:t>
-      </w:r>
-    </w:p>
-    <w:p>
-      <w:pPr>
-        <w:pStyle w:val="ListBullet"/>
-        <w:spacing w:before="20" w:after="40"/>
-      </w:pPr>
-      <w:r>
-        <w:rPr>
-          <w:rFonts w:ascii="Calibri" w:hAnsi="Calibri"/>
-          <w:b/>
-          <w:i w:val="0"/>
-          <w:sz w:val="22"/>
-        </w:rPr>
-        <w:t>Início:</w:t>
-      </w:r>
-      <w:r>
-        <w:rPr>
-          <w:rFonts w:ascii="Calibri" w:hAnsi="Calibri"/>
-          <w:b w:val="0"/>
-          <w:i w:val="0"/>
-          <w:sz w:val="22"/>
-        </w:rPr>
-        <w:t xml:space="preserve"> 19/05/2026 (Kickoff) · </w:t>
-      </w:r>
-      <w:r>
-        <w:rPr>
-          <w:rFonts w:ascii="Calibri" w:hAnsi="Calibri"/>
-          <w:b/>
-          <w:i w:val="0"/>
-          <w:sz w:val="22"/>
-        </w:rPr>
-        <w:t>Encerramento previsto:</w:t>
-      </w:r>
-      <w:r>
-        <w:rPr>
-          <w:rFonts w:ascii="Calibri" w:hAnsi="Calibri"/>
-          <w:b w:val="0"/>
-          <w:i w:val="0"/>
-          <w:sz w:val="22"/>
-        </w:rPr>
-        <w:t xml:space="preserve"> 11/07/2026.</w:t>
-      </w:r>
-    </w:p>
-    <w:p>
-      <w:pPr>
-        <w:pStyle w:val="ListBullet"/>
-        <w:spacing w:before="20" w:after="40"/>
-      </w:pPr>
-      <w:r>
-        <w:rPr>
-          <w:rFonts w:ascii="Calibri" w:hAnsi="Calibri"/>
-          <w:b/>
-          <w:i w:val="0"/>
-          <w:sz w:val="22"/>
-        </w:rPr>
-        <w:t>Status atual (15/06/2026):</w:t>
-      </w:r>
-      <w:r>
-        <w:rPr>
-          <w:rFonts w:ascii="Calibri" w:hAnsi="Calibri"/>
-          <w:b w:val="0"/>
-          <w:i w:val="0"/>
-          <w:sz w:val="22"/>
-        </w:rPr>
-        <w:t xml:space="preserve"> em execução — Sprint 1 concluída e aceita (06/06/2026); Sprint 2 em andamento; Sprints 3 e 4 planejadas.</w:t>
-      </w:r>
-    </w:p>
-    <w:p>
-      <w:pPr>
-        <w:pStyle w:val="ListBullet"/>
-        <w:spacing w:before="20" w:after="40"/>
-      </w:pPr>
-      <w:r>
-        <w:rPr>
-          <w:rFonts w:ascii="Calibri" w:hAnsi="Calibri"/>
-          <w:b/>
-          <w:i w:val="0"/>
-          <w:sz w:val="22"/>
-        </w:rPr>
-        <w:t>Nível de adaptação:</w:t>
-      </w:r>
-      <w:r>
-        <w:rPr>
-          <w:rFonts w:ascii="Calibri" w:hAnsi="Calibri"/>
-          <w:b w:val="0"/>
-          <w:i w:val="0"/>
-          <w:sz w:val="22"/>
-        </w:rPr>
-        <w:t xml:space="preserve"> 2 — Padrão (ver ADAP-AASP01-001).</w:t>
-      </w:r>
-    </w:p>
-    <w:p>
-      <w:pPr>
-        <w:pStyle w:val="ListBullet"/>
-        <w:spacing w:before="20" w:after="40"/>
-      </w:pPr>
-      <w:r>
-        <w:rPr>
-          <w:rFonts w:ascii="Calibri" w:hAnsi="Calibri"/>
-          <w:b/>
-          <w:i w:val="0"/>
-          <w:sz w:val="22"/>
-        </w:rPr>
-        <w:t>Fases do processo-padrão (PRO-GPC-001):</w:t>
-      </w:r>
-      <w:r>
-        <w:rPr>
-          <w:rFonts w:ascii="Calibri" w:hAnsi="Calibri"/>
-          <w:b w:val="0"/>
-          <w:i w:val="0"/>
-          <w:sz w:val="22"/>
-        </w:rPr>
-        <w:t xml:space="preserve"> Abertura, Discovery/Requisitos, Concepção e Planejamento concluídas; Desenvolvimento em curso; Homologação e Encerramento previstos para a Sprint 4.</w:t>
-      </w:r>
-    </w:p>
-    <w:p>
-      <w:pPr>
-        <w:pStyle w:val="Heading1"/>
-        <w:keepNext/>
-        <w:keepLines/>
-        <w:pBdr>
-          <w:bottom w:val="single" w:sz="4" w:space="2" w:color="D6E4F0"/>
-        </w:pBdr>
-      </w:pPr>
-      <w:r>
-        <w:t>2. Registros do projeto</w:t>
-      </w:r>
-    </w:p>
-    <w:p>
-      <w:pPr>
-        <w:spacing w:before="0" w:after="120"/>
-      </w:pPr>
-      <w:r>
-        <w:rPr>
-          <w:rFonts w:ascii="Calibri" w:hAnsi="Calibri"/>
-          <w:b/>
-          <w:i w:val="0"/>
-          <w:sz w:val="22"/>
-        </w:rPr>
-        <w:t>Legenda de status:</w:t>
-      </w:r>
-      <w:r>
-        <w:rPr>
-          <w:rFonts w:ascii="Calibri" w:hAnsi="Calibri"/>
-          <w:b w:val="0"/>
-          <w:i w:val="0"/>
-          <w:sz w:val="22"/>
-        </w:rPr>
-        <w:t xml:space="preserve"> ✅ gerado e no repositório · ⏳ previsto (encerramento).</w:t>
-      </w:r>
-    </w:p>
-    <w:tbl>
-      <w:tblPr>
-        <w:tblW w:type="auto" w:w="0"/>
-        <w:tblLook w:firstColumn="1" w:firstRow="1" w:lastColumn="0" w:lastRow="0" w:noHBand="0" w:noVBand="1" w:val="04A0"/>
-        <w:tblBorders>
-          <w:top w:val="single" w:sz="4" w:space="0" w:color="003366"/>
-          <w:left w:val="single" w:sz="4" w:space="0" w:color="003366"/>
-          <w:bottom w:val="single" w:sz="4" w:space="0" w:color="003366"/>
-          <w:right w:val="single" w:sz="4" w:space="0" w:color="003366"/>
-          <w:insideH w:val="single" w:sz="4" w:space="0" w:color="003366"/>
-          <w:insideV w:val="single" w:sz="4" w:space="0" w:color="003366"/>
-        </w:tblBorders>
-      </w:tblPr>
-      <w:tblGrid>
-        <w:gridCol w:w="1780"/>
-        <w:gridCol w:w="1780"/>
-        <w:gridCol w:w="1780"/>
-        <w:gridCol w:w="1780"/>
-        <w:gridCol w:w="1780"/>
-      </w:tblGrid>
-      <w:tr>
-        <w:trPr>
-          <w:cantSplit w:val="1"/>
-        </w:trPr>
-        <w:tc>
-          <w:tcPr>
-            <w:tcW w:type="dxa" w:w="1780"/>
-            <w:tcMar>
-              <w:top w:w="60" w:type="dxa"/>
-              <w:bottom w:w="60" w:type="dxa"/>
-              <w:left w:w="100" w:type="dxa"/>
-              <w:right w:w="100" w:type="dxa"/>
-            </w:tcMar>
-            <w:shd w:val="clear" w:color="auto" w:fill="003366"/>
+            <w:shd w:val="clear" w:color="auto" w:fill="1F3864"/>
           </w:tcPr>
           <w:p>
             <w:pPr>
@@ -828,119 +836,10 @@
               <w:rPr>
                 <w:rFonts w:ascii="Calibri" w:hAnsi="Calibri"/>
                 <w:b/>
-                <w:i w:val="0"/>
                 <w:color w:val="FFFFFF"/>
                 <w:sz w:val="20"/>
               </w:rPr>
-              <w:t>#</w:t>
-            </w:r>
-          </w:p>
-        </w:tc>
-        <w:tc>
-          <w:tcPr>
-            <w:tcW w:type="dxa" w:w="1780"/>
-            <w:tcMar>
-              <w:top w:w="60" w:type="dxa"/>
-              <w:bottom w:w="60" w:type="dxa"/>
-              <w:left w:w="100" w:type="dxa"/>
-              <w:right w:w="100" w:type="dxa"/>
-            </w:tcMar>
-            <w:shd w:val="clear" w:color="auto" w:fill="003366"/>
-          </w:tcPr>
-          <w:p>
-            <w:pPr>
-              <w:spacing w:before="40" w:after="40"/>
-            </w:pPr>
-            <w:r>
-              <w:rPr>
-                <w:rFonts w:ascii="Calibri" w:hAnsi="Calibri"/>
-                <w:b/>
-                <w:i w:val="0"/>
-                <w:color w:val="FFFFFF"/>
-                <w:sz w:val="20"/>
-              </w:rPr>
-              <w:t>Código</w:t>
-            </w:r>
-          </w:p>
-        </w:tc>
-        <w:tc>
-          <w:tcPr>
-            <w:tcW w:type="dxa" w:w="1780"/>
-            <w:tcMar>
-              <w:top w:w="60" w:type="dxa"/>
-              <w:bottom w:w="60" w:type="dxa"/>
-              <w:left w:w="100" w:type="dxa"/>
-              <w:right w:w="100" w:type="dxa"/>
-            </w:tcMar>
-            <w:shd w:val="clear" w:color="auto" w:fill="003366"/>
-          </w:tcPr>
-          <w:p>
-            <w:pPr>
-              <w:spacing w:before="40" w:after="40"/>
-            </w:pPr>
-            <w:r>
-              <w:rPr>
-                <w:rFonts w:ascii="Calibri" w:hAnsi="Calibri"/>
-                <w:b/>
-                <w:i w:val="0"/>
-                <w:color w:val="FFFFFF"/>
-                <w:sz w:val="20"/>
-              </w:rPr>
-              <w:t>Documento</w:t>
-            </w:r>
-          </w:p>
-        </w:tc>
-        <w:tc>
-          <w:tcPr>
-            <w:tcW w:type="dxa" w:w="1780"/>
-            <w:tcMar>
-              <w:top w:w="60" w:type="dxa"/>
-              <w:bottom w:w="60" w:type="dxa"/>
-              <w:left w:w="100" w:type="dxa"/>
-              <w:right w:w="100" w:type="dxa"/>
-            </w:tcMar>
-            <w:shd w:val="clear" w:color="auto" w:fill="003366"/>
-          </w:tcPr>
-          <w:p>
-            <w:pPr>
-              <w:spacing w:before="40" w:after="40"/>
-            </w:pPr>
-            <w:r>
-              <w:rPr>
-                <w:rFonts w:ascii="Calibri" w:hAnsi="Calibri"/>
-                <w:b/>
-                <w:i w:val="0"/>
-                <w:color w:val="FFFFFF"/>
-                <w:sz w:val="20"/>
-              </w:rPr>
-              <w:t>Processo</w:t>
-            </w:r>
-          </w:p>
-        </w:tc>
-        <w:tc>
-          <w:tcPr>
-            <w:tcW w:type="dxa" w:w="1780"/>
-            <w:tcMar>
-              <w:top w:w="60" w:type="dxa"/>
-              <w:bottom w:w="60" w:type="dxa"/>
-              <w:left w:w="100" w:type="dxa"/>
-              <w:right w:w="100" w:type="dxa"/>
-            </w:tcMar>
-            <w:shd w:val="clear" w:color="auto" w:fill="003366"/>
-          </w:tcPr>
-          <w:p>
-            <w:pPr>
-              <w:spacing w:before="40" w:after="40"/>
-            </w:pPr>
-            <w:r>
-              <w:rPr>
-                <w:rFonts w:ascii="Calibri" w:hAnsi="Calibri"/>
-                <w:b/>
-                <w:i w:val="0"/>
-                <w:color w:val="FFFFFF"/>
-                <w:sz w:val="20"/>
-              </w:rPr>
-              <w:t>Status</w:t>
+              <w:t xml:space="preserve">Status</w:t>
             </w:r>
           </w:p>
         </w:tc>
@@ -955,10 +854,10 @@
             <w:tcMar>
               <w:top w:w="60" w:type="dxa"/>
               <w:bottom w:w="60" w:type="dxa"/>
-              <w:left w:w="100" w:type="dxa"/>
-              <w:right w:w="100" w:type="dxa"/>
+              <w:left w:w="80" w:type="dxa"/>
+              <w:right w:w="80" w:type="dxa"/>
             </w:tcMar>
-            <w:shd w:val="clear" w:color="auto" w:fill="EBF5FB"/>
+            <w:shd w:val="clear" w:color="auto" w:fill="D6E4F0"/>
           </w:tcPr>
           <w:p>
             <w:pPr>
@@ -968,10 +867,9 @@
               <w:rPr>
                 <w:rFonts w:ascii="Calibri" w:hAnsi="Calibri"/>
                 <w:b w:val="0"/>
-                <w:i w:val="0"/>
                 <w:sz w:val="20"/>
               </w:rPr>
-              <w:t>1</w:t>
+              <w:t xml:space="preserve">1</w:t>
             </w:r>
           </w:p>
         </w:tc>
@@ -981,10 +879,10 @@
             <w:tcMar>
               <w:top w:w="60" w:type="dxa"/>
               <w:bottom w:w="60" w:type="dxa"/>
-              <w:left w:w="100" w:type="dxa"/>
-              <w:right w:w="100" w:type="dxa"/>
+              <w:left w:w="80" w:type="dxa"/>
+              <w:right w:w="80" w:type="dxa"/>
             </w:tcMar>
-            <w:shd w:val="clear" w:color="auto" w:fill="EBF5FB"/>
+            <w:shd w:val="clear" w:color="auto" w:fill="D6E4F0"/>
           </w:tcPr>
           <w:p>
             <w:pPr>
@@ -994,10 +892,9 @@
               <w:rPr>
                 <w:rFonts w:ascii="Calibri" w:hAnsi="Calibri"/>
                 <w:b w:val="0"/>
-                <w:i w:val="0"/>
                 <w:sz w:val="20"/>
               </w:rPr>
-              <w:t>TAP-AASP01-001</w:t>
+              <w:t xml:space="preserve">TAP-AASP01-001</w:t>
             </w:r>
           </w:p>
         </w:tc>
@@ -1007,10 +904,10 @@
             <w:tcMar>
               <w:top w:w="60" w:type="dxa"/>
               <w:bottom w:w="60" w:type="dxa"/>
-              <w:left w:w="100" w:type="dxa"/>
-              <w:right w:w="100" w:type="dxa"/>
+              <w:left w:w="80" w:type="dxa"/>
+              <w:right w:w="80" w:type="dxa"/>
             </w:tcMar>
-            <w:shd w:val="clear" w:color="auto" w:fill="EBF5FB"/>
+            <w:shd w:val="clear" w:color="auto" w:fill="D6E4F0"/>
           </w:tcPr>
           <w:p>
             <w:pPr>
@@ -1020,10 +917,9 @@
               <w:rPr>
                 <w:rFonts w:ascii="Calibri" w:hAnsi="Calibri"/>
                 <w:b w:val="0"/>
-                <w:i w:val="0"/>
                 <w:sz w:val="20"/>
               </w:rPr>
-              <w:t>Termo de Abertura</w:t>
+              <w:t xml:space="preserve">Termo de Abertura</w:t>
             </w:r>
           </w:p>
         </w:tc>
@@ -1033,10 +929,10 @@
             <w:tcMar>
               <w:top w:w="60" w:type="dxa"/>
               <w:bottom w:w="60" w:type="dxa"/>
-              <w:left w:w="100" w:type="dxa"/>
-              <w:right w:w="100" w:type="dxa"/>
+              <w:left w:w="80" w:type="dxa"/>
+              <w:right w:w="80" w:type="dxa"/>
             </w:tcMar>
-            <w:shd w:val="clear" w:color="auto" w:fill="EBF5FB"/>
+            <w:shd w:val="clear" w:color="auto" w:fill="D6E4F0"/>
           </w:tcPr>
           <w:p>
             <w:pPr>
@@ -1046,23 +942,22 @@
               <w:rPr>
                 <w:rFonts w:ascii="Calibri" w:hAnsi="Calibri"/>
                 <w:b w:val="0"/>
-                <w:i w:val="0"/>
                 <w:sz w:val="20"/>
               </w:rPr>
-              <w:t>GPR</w:t>
+              <w:t xml:space="preserve">GPR</w:t>
             </w:r>
           </w:p>
         </w:tc>
         <w:tc>
           <w:tcPr>
-            <w:tcW w:type="dxa" w:w="1780"/>
+            <w:tcW w:type="dxa" w:w="1782"/>
             <w:tcMar>
               <w:top w:w="60" w:type="dxa"/>
               <w:bottom w:w="60" w:type="dxa"/>
-              <w:left w:w="100" w:type="dxa"/>
-              <w:right w:w="100" w:type="dxa"/>
+              <w:left w:w="80" w:type="dxa"/>
+              <w:right w:w="80" w:type="dxa"/>
             </w:tcMar>
-            <w:shd w:val="clear" w:color="auto" w:fill="EBF5FB"/>
+            <w:shd w:val="clear" w:color="auto" w:fill="D6E4F0"/>
           </w:tcPr>
           <w:p>
             <w:pPr>
@@ -1072,10 +967,9 @@
               <w:rPr>
                 <w:rFonts w:ascii="Calibri" w:hAnsi="Calibri"/>
                 <w:b w:val="0"/>
-                <w:i w:val="0"/>
                 <w:sz w:val="20"/>
               </w:rPr>
-              <w:t>✅</w:t>
+              <w:t xml:space="preserve">Gerado</w:t>
             </w:r>
           </w:p>
         </w:tc>
@@ -1090,8 +984,8 @@
             <w:tcMar>
               <w:top w:w="60" w:type="dxa"/>
               <w:bottom w:w="60" w:type="dxa"/>
-              <w:left w:w="100" w:type="dxa"/>
-              <w:right w:w="100" w:type="dxa"/>
+              <w:left w:w="80" w:type="dxa"/>
+              <w:right w:w="80" w:type="dxa"/>
             </w:tcMar>
           </w:tcPr>
           <w:p>
@@ -1102,10 +996,9 @@
               <w:rPr>
                 <w:rFonts w:ascii="Calibri" w:hAnsi="Calibri"/>
                 <w:b w:val="0"/>
-                <w:i w:val="0"/>
                 <w:sz w:val="20"/>
               </w:rPr>
-              <w:t>2</w:t>
+              <w:t xml:space="preserve">2</w:t>
             </w:r>
           </w:p>
         </w:tc>
@@ -1115,8 +1008,8 @@
             <w:tcMar>
               <w:top w:w="60" w:type="dxa"/>
               <w:bottom w:w="60" w:type="dxa"/>
-              <w:left w:w="100" w:type="dxa"/>
-              <w:right w:w="100" w:type="dxa"/>
+              <w:left w:w="80" w:type="dxa"/>
+              <w:right w:w="80" w:type="dxa"/>
             </w:tcMar>
           </w:tcPr>
           <w:p>
@@ -1127,10 +1020,9 @@
               <w:rPr>
                 <w:rFonts w:ascii="Calibri" w:hAnsi="Calibri"/>
                 <w:b w:val="0"/>
-                <w:i w:val="0"/>
                 <w:sz w:val="20"/>
               </w:rPr>
-              <w:t>PLA-AASP01-001</w:t>
+              <w:t xml:space="preserve">PLA-AASP01-001</w:t>
             </w:r>
           </w:p>
         </w:tc>
@@ -1140,8 +1032,8 @@
             <w:tcMar>
               <w:top w:w="60" w:type="dxa"/>
               <w:bottom w:w="60" w:type="dxa"/>
-              <w:left w:w="100" w:type="dxa"/>
-              <w:right w:w="100" w:type="dxa"/>
+              <w:left w:w="80" w:type="dxa"/>
+              <w:right w:w="80" w:type="dxa"/>
             </w:tcMar>
           </w:tcPr>
           <w:p>
@@ -1152,10 +1044,9 @@
               <w:rPr>
                 <w:rFonts w:ascii="Calibri" w:hAnsi="Calibri"/>
                 <w:b w:val="0"/>
-                <w:i w:val="0"/>
                 <w:sz w:val="20"/>
               </w:rPr>
-              <w:t>Plano de Projeto</w:t>
+              <w:t xml:space="preserve">Plano de Projeto</w:t>
             </w:r>
           </w:p>
         </w:tc>
@@ -1165,8 +1056,8 @@
             <w:tcMar>
               <w:top w:w="60" w:type="dxa"/>
               <w:bottom w:w="60" w:type="dxa"/>
-              <w:left w:w="100" w:type="dxa"/>
-              <w:right w:w="100" w:type="dxa"/>
+              <w:left w:w="80" w:type="dxa"/>
+              <w:right w:w="80" w:type="dxa"/>
             </w:tcMar>
           </w:tcPr>
           <w:p>
@@ -1177,21 +1068,20 @@
               <w:rPr>
                 <w:rFonts w:ascii="Calibri" w:hAnsi="Calibri"/>
                 <w:b w:val="0"/>
-                <w:i w:val="0"/>
                 <w:sz w:val="20"/>
               </w:rPr>
-              <w:t>GPR</w:t>
+              <w:t xml:space="preserve">GPR</w:t>
             </w:r>
           </w:p>
         </w:tc>
         <w:tc>
           <w:tcPr>
-            <w:tcW w:type="dxa" w:w="1780"/>
+            <w:tcW w:type="dxa" w:w="1782"/>
             <w:tcMar>
               <w:top w:w="60" w:type="dxa"/>
               <w:bottom w:w="60" w:type="dxa"/>
-              <w:left w:w="100" w:type="dxa"/>
-              <w:right w:w="100" w:type="dxa"/>
+              <w:left w:w="80" w:type="dxa"/>
+              <w:right w:w="80" w:type="dxa"/>
             </w:tcMar>
           </w:tcPr>
           <w:p>
@@ -1202,10 +1092,9 @@
               <w:rPr>
                 <w:rFonts w:ascii="Calibri" w:hAnsi="Calibri"/>
                 <w:b w:val="0"/>
-                <w:i w:val="0"/>
                 <w:sz w:val="20"/>
               </w:rPr>
-              <w:t>✅</w:t>
+              <w:t xml:space="preserve">Gerado</w:t>
             </w:r>
           </w:p>
         </w:tc>
@@ -1220,10 +1109,10 @@
             <w:tcMar>
               <w:top w:w="60" w:type="dxa"/>
               <w:bottom w:w="60" w:type="dxa"/>
-              <w:left w:w="100" w:type="dxa"/>
-              <w:right w:w="100" w:type="dxa"/>
+              <w:left w:w="80" w:type="dxa"/>
+              <w:right w:w="80" w:type="dxa"/>
             </w:tcMar>
-            <w:shd w:val="clear" w:color="auto" w:fill="EBF5FB"/>
+            <w:shd w:val="clear" w:color="auto" w:fill="D6E4F0"/>
           </w:tcPr>
           <w:p>
             <w:pPr>
@@ -1233,10 +1122,9 @@
               <w:rPr>
                 <w:rFonts w:ascii="Calibri" w:hAnsi="Calibri"/>
                 <w:b w:val="0"/>
-                <w:i w:val="0"/>
                 <w:sz w:val="20"/>
               </w:rPr>
-              <w:t>3</w:t>
+              <w:t xml:space="preserve">3</w:t>
             </w:r>
           </w:p>
         </w:tc>
@@ -1246,10 +1134,10 @@
             <w:tcMar>
               <w:top w:w="60" w:type="dxa"/>
               <w:bottom w:w="60" w:type="dxa"/>
-              <w:left w:w="100" w:type="dxa"/>
-              <w:right w:w="100" w:type="dxa"/>
+              <w:left w:w="80" w:type="dxa"/>
+              <w:right w:w="80" w:type="dxa"/>
             </w:tcMar>
-            <w:shd w:val="clear" w:color="auto" w:fill="EBF5FB"/>
+            <w:shd w:val="clear" w:color="auto" w:fill="D6E4F0"/>
           </w:tcPr>
           <w:p>
             <w:pPr>
@@ -1259,10 +1147,9 @@
               <w:rPr>
                 <w:rFonts w:ascii="Calibri" w:hAnsi="Calibri"/>
                 <w:b w:val="0"/>
-                <w:i w:val="0"/>
                 <w:sz w:val="20"/>
               </w:rPr>
-              <w:t>ADAP-AASP01-001</w:t>
+              <w:t xml:space="preserve">ADAP-AASP01-001</w:t>
             </w:r>
           </w:p>
         </w:tc>
@@ -1272,10 +1159,10 @@
             <w:tcMar>
               <w:top w:w="60" w:type="dxa"/>
               <w:bottom w:w="60" w:type="dxa"/>
-              <w:left w:w="100" w:type="dxa"/>
-              <w:right w:w="100" w:type="dxa"/>
+              <w:left w:w="80" w:type="dxa"/>
+              <w:right w:w="80" w:type="dxa"/>
             </w:tcMar>
-            <w:shd w:val="clear" w:color="auto" w:fill="EBF5FB"/>
+            <w:shd w:val="clear" w:color="auto" w:fill="D6E4F0"/>
           </w:tcPr>
           <w:p>
             <w:pPr>
@@ -1285,10 +1172,9 @@
               <w:rPr>
                 <w:rFonts w:ascii="Calibri" w:hAnsi="Calibri"/>
                 <w:b w:val="0"/>
-                <w:i w:val="0"/>
                 <w:sz w:val="20"/>
               </w:rPr>
-              <w:t>Registro de Adaptação</w:t>
+              <w:t xml:space="preserve">Registro de Adaptação</w:t>
             </w:r>
           </w:p>
         </w:tc>
@@ -1298,10 +1184,10 @@
             <w:tcMar>
               <w:top w:w="60" w:type="dxa"/>
               <w:bottom w:w="60" w:type="dxa"/>
-              <w:left w:w="100" w:type="dxa"/>
-              <w:right w:w="100" w:type="dxa"/>
+              <w:left w:w="80" w:type="dxa"/>
+              <w:right w:w="80" w:type="dxa"/>
             </w:tcMar>
-            <w:shd w:val="clear" w:color="auto" w:fill="EBF5FB"/>
+            <w:shd w:val="clear" w:color="auto" w:fill="D6E4F0"/>
           </w:tcPr>
           <w:p>
             <w:pPr>
@@ -1311,23 +1197,22 @@
               <w:rPr>
                 <w:rFonts w:ascii="Calibri" w:hAnsi="Calibri"/>
                 <w:b w:val="0"/>
-                <w:i w:val="0"/>
                 <w:sz w:val="20"/>
               </w:rPr>
-              <w:t>GPR</w:t>
+              <w:t xml:space="preserve">GPR</w:t>
             </w:r>
           </w:p>
         </w:tc>
         <w:tc>
           <w:tcPr>
-            <w:tcW w:type="dxa" w:w="1780"/>
+            <w:tcW w:type="dxa" w:w="1782"/>
             <w:tcMar>
               <w:top w:w="60" w:type="dxa"/>
               <w:bottom w:w="60" w:type="dxa"/>
-              <w:left w:w="100" w:type="dxa"/>
-              <w:right w:w="100" w:type="dxa"/>
+              <w:left w:w="80" w:type="dxa"/>
+              <w:right w:w="80" w:type="dxa"/>
             </w:tcMar>
-            <w:shd w:val="clear" w:color="auto" w:fill="EBF5FB"/>
+            <w:shd w:val="clear" w:color="auto" w:fill="D6E4F0"/>
           </w:tcPr>
           <w:p>
             <w:pPr>
@@ -1337,10 +1222,9 @@
               <w:rPr>
                 <w:rFonts w:ascii="Calibri" w:hAnsi="Calibri"/>
                 <w:b w:val="0"/>
-                <w:i w:val="0"/>
                 <w:sz w:val="20"/>
               </w:rPr>
-              <w:t>✅</w:t>
+              <w:t xml:space="preserve">Gerado</w:t>
             </w:r>
           </w:p>
         </w:tc>
@@ -1355,8 +1239,8 @@
             <w:tcMar>
               <w:top w:w="60" w:type="dxa"/>
               <w:bottom w:w="60" w:type="dxa"/>
-              <w:left w:w="100" w:type="dxa"/>
-              <w:right w:w="100" w:type="dxa"/>
+              <w:left w:w="80" w:type="dxa"/>
+              <w:right w:w="80" w:type="dxa"/>
             </w:tcMar>
           </w:tcPr>
           <w:p>
@@ -1367,10 +1251,9 @@
               <w:rPr>
                 <w:rFonts w:ascii="Calibri" w:hAnsi="Calibri"/>
                 <w:b w:val="0"/>
-                <w:i w:val="0"/>
                 <w:sz w:val="20"/>
               </w:rPr>
-              <w:t>4</w:t>
+              <w:t xml:space="preserve">4</w:t>
             </w:r>
           </w:p>
         </w:tc>
@@ -1380,8 +1263,8 @@
             <w:tcMar>
               <w:top w:w="60" w:type="dxa"/>
               <w:bottom w:w="60" w:type="dxa"/>
-              <w:left w:w="100" w:type="dxa"/>
-              <w:right w:w="100" w:type="dxa"/>
+              <w:left w:w="80" w:type="dxa"/>
+              <w:right w:w="80" w:type="dxa"/>
             </w:tcMar>
           </w:tcPr>
           <w:p>
@@ -1392,10 +1275,9 @@
               <w:rPr>
                 <w:rFonts w:ascii="Calibri" w:hAnsi="Calibri"/>
                 <w:b w:val="0"/>
-                <w:i w:val="0"/>
                 <w:sz w:val="20"/>
               </w:rPr>
-              <w:t>RAC-AASP01-001</w:t>
+              <w:t xml:space="preserve">RAC-AASP01-001</w:t>
             </w:r>
           </w:p>
         </w:tc>
@@ -1405,8 +1287,8 @@
             <w:tcMar>
               <w:top w:w="60" w:type="dxa"/>
               <w:bottom w:w="60" w:type="dxa"/>
-              <w:left w:w="100" w:type="dxa"/>
-              <w:right w:w="100" w:type="dxa"/>
+              <w:left w:w="80" w:type="dxa"/>
+              <w:right w:w="80" w:type="dxa"/>
             </w:tcMar>
           </w:tcPr>
           <w:p>
@@ -1417,10 +1299,9 @@
               <w:rPr>
                 <w:rFonts w:ascii="Calibri" w:hAnsi="Calibri"/>
                 <w:b w:val="0"/>
-                <w:i w:val="0"/>
                 <w:sz w:val="20"/>
               </w:rPr>
-              <w:t>Relatório de Acompanhamento</w:t>
+              <w:t xml:space="preserve">Relatório de Acompanhamento</w:t>
             </w:r>
           </w:p>
         </w:tc>
@@ -1430,8 +1311,8 @@
             <w:tcMar>
               <w:top w:w="60" w:type="dxa"/>
               <w:bottom w:w="60" w:type="dxa"/>
-              <w:left w:w="100" w:type="dxa"/>
-              <w:right w:w="100" w:type="dxa"/>
+              <w:left w:w="80" w:type="dxa"/>
+              <w:right w:w="80" w:type="dxa"/>
             </w:tcMar>
           </w:tcPr>
           <w:p>
@@ -1442,21 +1323,20 @@
               <w:rPr>
                 <w:rFonts w:ascii="Calibri" w:hAnsi="Calibri"/>
                 <w:b w:val="0"/>
-                <w:i w:val="0"/>
                 <w:sz w:val="20"/>
               </w:rPr>
-              <w:t>GPR</w:t>
+              <w:t xml:space="preserve">GPR</w:t>
             </w:r>
           </w:p>
         </w:tc>
         <w:tc>
           <w:tcPr>
-            <w:tcW w:type="dxa" w:w="1780"/>
+            <w:tcW w:type="dxa" w:w="1782"/>
             <w:tcMar>
               <w:top w:w="60" w:type="dxa"/>
               <w:bottom w:w="60" w:type="dxa"/>
-              <w:left w:w="100" w:type="dxa"/>
-              <w:right w:w="100" w:type="dxa"/>
+              <w:left w:w="80" w:type="dxa"/>
+              <w:right w:w="80" w:type="dxa"/>
             </w:tcMar>
           </w:tcPr>
           <w:p>
@@ -1467,10 +1347,9 @@
               <w:rPr>
                 <w:rFonts w:ascii="Calibri" w:hAnsi="Calibri"/>
                 <w:b w:val="0"/>
-                <w:i w:val="0"/>
                 <w:sz w:val="20"/>
               </w:rPr>
-              <w:t>✅</w:t>
+              <w:t xml:space="preserve">Gerado</w:t>
             </w:r>
           </w:p>
         </w:tc>
@@ -1485,10 +1364,10 @@
             <w:tcMar>
               <w:top w:w="60" w:type="dxa"/>
               <w:bottom w:w="60" w:type="dxa"/>
-              <w:left w:w="100" w:type="dxa"/>
-              <w:right w:w="100" w:type="dxa"/>
+              <w:left w:w="80" w:type="dxa"/>
+              <w:right w:w="80" w:type="dxa"/>
             </w:tcMar>
-            <w:shd w:val="clear" w:color="auto" w:fill="EBF5FB"/>
+            <w:shd w:val="clear" w:color="auto" w:fill="D6E4F0"/>
           </w:tcPr>
           <w:p>
             <w:pPr>
@@ -1498,10 +1377,9 @@
               <w:rPr>
                 <w:rFonts w:ascii="Calibri" w:hAnsi="Calibri"/>
                 <w:b w:val="0"/>
-                <w:i w:val="0"/>
                 <w:sz w:val="20"/>
               </w:rPr>
-              <w:t>5</w:t>
+              <w:t xml:space="preserve">5</w:t>
             </w:r>
           </w:p>
         </w:tc>
@@ -1511,10 +1389,10 @@
             <w:tcMar>
               <w:top w:w="60" w:type="dxa"/>
               <w:bottom w:w="60" w:type="dxa"/>
-              <w:left w:w="100" w:type="dxa"/>
-              <w:right w:w="100" w:type="dxa"/>
+              <w:left w:w="80" w:type="dxa"/>
+              <w:right w:w="80" w:type="dxa"/>
             </w:tcMar>
-            <w:shd w:val="clear" w:color="auto" w:fill="EBF5FB"/>
+            <w:shd w:val="clear" w:color="auto" w:fill="D6E4F0"/>
           </w:tcPr>
           <w:p>
             <w:pPr>
@@ -1524,10 +1402,9 @@
               <w:rPr>
                 <w:rFonts w:ascii="Calibri" w:hAnsi="Calibri"/>
                 <w:b w:val="0"/>
-                <w:i w:val="0"/>
                 <w:sz w:val="20"/>
               </w:rPr>
-              <w:t>CR-AASP01-001</w:t>
+              <w:t xml:space="preserve">CR-AASP01-001</w:t>
             </w:r>
           </w:p>
         </w:tc>
@@ -1537,10 +1414,10 @@
             <w:tcMar>
               <w:top w:w="60" w:type="dxa"/>
               <w:bottom w:w="60" w:type="dxa"/>
-              <w:left w:w="100" w:type="dxa"/>
-              <w:right w:w="100" w:type="dxa"/>
+              <w:left w:w="80" w:type="dxa"/>
+              <w:right w:w="80" w:type="dxa"/>
             </w:tcMar>
-            <w:shd w:val="clear" w:color="auto" w:fill="EBF5FB"/>
+            <w:shd w:val="clear" w:color="auto" w:fill="D6E4F0"/>
           </w:tcPr>
           <w:p>
             <w:pPr>
@@ -1550,10 +1427,9 @@
               <w:rPr>
                 <w:rFonts w:ascii="Calibri" w:hAnsi="Calibri"/>
                 <w:b w:val="0"/>
-                <w:i w:val="0"/>
                 <w:sz w:val="20"/>
               </w:rPr>
-              <w:t>Registro de Change Requests</w:t>
+              <w:t xml:space="preserve">Registro de Change Requests</w:t>
             </w:r>
           </w:p>
         </w:tc>
@@ -1563,10 +1439,10 @@
             <w:tcMar>
               <w:top w:w="60" w:type="dxa"/>
               <w:bottom w:w="60" w:type="dxa"/>
-              <w:left w:w="100" w:type="dxa"/>
-              <w:right w:w="100" w:type="dxa"/>
+              <w:left w:w="80" w:type="dxa"/>
+              <w:right w:w="80" w:type="dxa"/>
             </w:tcMar>
-            <w:shd w:val="clear" w:color="auto" w:fill="EBF5FB"/>
+            <w:shd w:val="clear" w:color="auto" w:fill="D6E4F0"/>
           </w:tcPr>
           <w:p>
             <w:pPr>
@@ -1576,23 +1452,22 @@
               <w:rPr>
                 <w:rFonts w:ascii="Calibri" w:hAnsi="Calibri"/>
                 <w:b w:val="0"/>
-                <w:i w:val="0"/>
                 <w:sz w:val="20"/>
               </w:rPr>
-              <w:t>GPR / GCO</w:t>
+              <w:t xml:space="preserve">GPR / GCO</w:t>
             </w:r>
           </w:p>
         </w:tc>
         <w:tc>
           <w:tcPr>
-            <w:tcW w:type="dxa" w:w="1780"/>
+            <w:tcW w:type="dxa" w:w="1782"/>
             <w:tcMar>
               <w:top w:w="60" w:type="dxa"/>
               <w:bottom w:w="60" w:type="dxa"/>
-              <w:left w:w="100" w:type="dxa"/>
-              <w:right w:w="100" w:type="dxa"/>
+              <w:left w:w="80" w:type="dxa"/>
+              <w:right w:w="80" w:type="dxa"/>
             </w:tcMar>
-            <w:shd w:val="clear" w:color="auto" w:fill="EBF5FB"/>
+            <w:shd w:val="clear" w:color="auto" w:fill="D6E4F0"/>
           </w:tcPr>
           <w:p>
             <w:pPr>
@@ -1602,10 +1477,9 @@
               <w:rPr>
                 <w:rFonts w:ascii="Calibri" w:hAnsi="Calibri"/>
                 <w:b w:val="0"/>
-                <w:i w:val="0"/>
                 <w:sz w:val="20"/>
               </w:rPr>
-              <w:t>✅</w:t>
+              <w:t xml:space="preserve">Gerado</w:t>
             </w:r>
           </w:p>
         </w:tc>
@@ -1620,8 +1494,8 @@
             <w:tcMar>
               <w:top w:w="60" w:type="dxa"/>
               <w:bottom w:w="60" w:type="dxa"/>
-              <w:left w:w="100" w:type="dxa"/>
-              <w:right w:w="100" w:type="dxa"/>
+              <w:left w:w="80" w:type="dxa"/>
+              <w:right w:w="80" w:type="dxa"/>
             </w:tcMar>
           </w:tcPr>
           <w:p>
@@ -1632,10 +1506,9 @@
               <w:rPr>
                 <w:rFonts w:ascii="Calibri" w:hAnsi="Calibri"/>
                 <w:b w:val="0"/>
-                <w:i w:val="0"/>
                 <w:sz w:val="20"/>
               </w:rPr>
-              <w:t>6</w:t>
+              <w:t xml:space="preserve">6</w:t>
             </w:r>
           </w:p>
         </w:tc>
@@ -1645,8 +1518,8 @@
             <w:tcMar>
               <w:top w:w="60" w:type="dxa"/>
               <w:bottom w:w="60" w:type="dxa"/>
-              <w:left w:w="100" w:type="dxa"/>
-              <w:right w:w="100" w:type="dxa"/>
+              <w:left w:w="80" w:type="dxa"/>
+              <w:right w:w="80" w:type="dxa"/>
             </w:tcMar>
           </w:tcPr>
           <w:p>
@@ -1657,10 +1530,9 @@
               <w:rPr>
                 <w:rFonts w:ascii="Calibri" w:hAnsi="Calibri"/>
                 <w:b w:val="0"/>
-                <w:i w:val="0"/>
                 <w:sz w:val="20"/>
               </w:rPr>
-              <w:t>REQ-AASP01-001</w:t>
+              <w:t xml:space="preserve">REQ-AASP01-001</w:t>
             </w:r>
           </w:p>
         </w:tc>
@@ -1670,8 +1542,8 @@
             <w:tcMar>
               <w:top w:w="60" w:type="dxa"/>
               <w:bottom w:w="60" w:type="dxa"/>
-              <w:left w:w="100" w:type="dxa"/>
-              <w:right w:w="100" w:type="dxa"/>
+              <w:left w:w="80" w:type="dxa"/>
+              <w:right w:w="80" w:type="dxa"/>
             </w:tcMar>
           </w:tcPr>
           <w:p>
@@ -1682,10 +1554,9 @@
               <w:rPr>
                 <w:rFonts w:ascii="Calibri" w:hAnsi="Calibri"/>
                 <w:b w:val="0"/>
-                <w:i w:val="0"/>
                 <w:sz w:val="20"/>
               </w:rPr>
-              <w:t>Documento de Requisitos</w:t>
+              <w:t xml:space="preserve">Documento de Requisitos</w:t>
             </w:r>
           </w:p>
         </w:tc>
@@ -1695,8 +1566,8 @@
             <w:tcMar>
               <w:top w:w="60" w:type="dxa"/>
               <w:bottom w:w="60" w:type="dxa"/>
-              <w:left w:w="100" w:type="dxa"/>
-              <w:right w:w="100" w:type="dxa"/>
+              <w:left w:w="80" w:type="dxa"/>
+              <w:right w:w="80" w:type="dxa"/>
             </w:tcMar>
           </w:tcPr>
           <w:p>
@@ -1707,21 +1578,20 @@
               <w:rPr>
                 <w:rFonts w:ascii="Calibri" w:hAnsi="Calibri"/>
                 <w:b w:val="0"/>
-                <w:i w:val="0"/>
                 <w:sz w:val="20"/>
               </w:rPr>
-              <w:t>REQ</w:t>
+              <w:t xml:space="preserve">REQ</w:t>
             </w:r>
           </w:p>
         </w:tc>
         <w:tc>
           <w:tcPr>
-            <w:tcW w:type="dxa" w:w="1780"/>
+            <w:tcW w:type="dxa" w:w="1782"/>
             <w:tcMar>
               <w:top w:w="60" w:type="dxa"/>
               <w:bottom w:w="60" w:type="dxa"/>
-              <w:left w:w="100" w:type="dxa"/>
-              <w:right w:w="100" w:type="dxa"/>
+              <w:left w:w="80" w:type="dxa"/>
+              <w:right w:w="80" w:type="dxa"/>
             </w:tcMar>
           </w:tcPr>
           <w:p>
@@ -1732,10 +1602,9 @@
               <w:rPr>
                 <w:rFonts w:ascii="Calibri" w:hAnsi="Calibri"/>
                 <w:b w:val="0"/>
-                <w:i w:val="0"/>
                 <w:sz w:val="20"/>
               </w:rPr>
-              <w:t>✅</w:t>
+              <w:t xml:space="preserve">Gerado</w:t>
             </w:r>
           </w:p>
         </w:tc>
@@ -1750,10 +1619,10 @@
             <w:tcMar>
               <w:top w:w="60" w:type="dxa"/>
               <w:bottom w:w="60" w:type="dxa"/>
-              <w:left w:w="100" w:type="dxa"/>
-              <w:right w:w="100" w:type="dxa"/>
+              <w:left w:w="80" w:type="dxa"/>
+              <w:right w:w="80" w:type="dxa"/>
             </w:tcMar>
-            <w:shd w:val="clear" w:color="auto" w:fill="EBF5FB"/>
+            <w:shd w:val="clear" w:color="auto" w:fill="D6E4F0"/>
           </w:tcPr>
           <w:p>
             <w:pPr>
@@ -1763,10 +1632,9 @@
               <w:rPr>
                 <w:rFonts w:ascii="Calibri" w:hAnsi="Calibri"/>
                 <w:b w:val="0"/>
-                <w:i w:val="0"/>
                 <w:sz w:val="20"/>
               </w:rPr>
-              <w:t>7</w:t>
+              <w:t xml:space="preserve">7</w:t>
             </w:r>
           </w:p>
         </w:tc>
@@ -1776,10 +1644,10 @@
             <w:tcMar>
               <w:top w:w="60" w:type="dxa"/>
               <w:bottom w:w="60" w:type="dxa"/>
-              <w:left w:w="100" w:type="dxa"/>
-              <w:right w:w="100" w:type="dxa"/>
+              <w:left w:w="80" w:type="dxa"/>
+              <w:right w:w="80" w:type="dxa"/>
             </w:tcMar>
-            <w:shd w:val="clear" w:color="auto" w:fill="EBF5FB"/>
+            <w:shd w:val="clear" w:color="auto" w:fill="D6E4F0"/>
           </w:tcPr>
           <w:p>
             <w:pPr>
@@ -1789,10 +1657,9 @@
               <w:rPr>
                 <w:rFonts w:ascii="Calibri" w:hAnsi="Calibri"/>
                 <w:b w:val="0"/>
-                <w:i w:val="0"/>
                 <w:sz w:val="20"/>
               </w:rPr>
-              <w:t>RASTR-AASP01-001</w:t>
+              <w:t xml:space="preserve">RASTR-AASP01-001</w:t>
             </w:r>
           </w:p>
         </w:tc>
@@ -1802,10 +1669,10 @@
             <w:tcMar>
               <w:top w:w="60" w:type="dxa"/>
               <w:bottom w:w="60" w:type="dxa"/>
-              <w:left w:w="100" w:type="dxa"/>
-              <w:right w:w="100" w:type="dxa"/>
+              <w:left w:w="80" w:type="dxa"/>
+              <w:right w:w="80" w:type="dxa"/>
             </w:tcMar>
-            <w:shd w:val="clear" w:color="auto" w:fill="EBF5FB"/>
+            <w:shd w:val="clear" w:color="auto" w:fill="D6E4F0"/>
           </w:tcPr>
           <w:p>
             <w:pPr>
@@ -1815,10 +1682,9 @@
               <w:rPr>
                 <w:rFonts w:ascii="Calibri" w:hAnsi="Calibri"/>
                 <w:b w:val="0"/>
-                <w:i w:val="0"/>
                 <w:sz w:val="20"/>
               </w:rPr>
-              <w:t>Matriz de Rastreabilidade</w:t>
+              <w:t xml:space="preserve">Matriz de Rastreabilidade</w:t>
             </w:r>
           </w:p>
         </w:tc>
@@ -1828,10 +1694,10 @@
             <w:tcMar>
               <w:top w:w="60" w:type="dxa"/>
               <w:bottom w:w="60" w:type="dxa"/>
-              <w:left w:w="100" w:type="dxa"/>
-              <w:right w:w="100" w:type="dxa"/>
+              <w:left w:w="80" w:type="dxa"/>
+              <w:right w:w="80" w:type="dxa"/>
             </w:tcMar>
-            <w:shd w:val="clear" w:color="auto" w:fill="EBF5FB"/>
+            <w:shd w:val="clear" w:color="auto" w:fill="D6E4F0"/>
           </w:tcPr>
           <w:p>
             <w:pPr>
@@ -1841,23 +1707,22 @@
               <w:rPr>
                 <w:rFonts w:ascii="Calibri" w:hAnsi="Calibri"/>
                 <w:b w:val="0"/>
-                <w:i w:val="0"/>
                 <w:sz w:val="20"/>
               </w:rPr>
-              <w:t>REQ</w:t>
+              <w:t xml:space="preserve">REQ</w:t>
             </w:r>
           </w:p>
         </w:tc>
         <w:tc>
           <w:tcPr>
-            <w:tcW w:type="dxa" w:w="1780"/>
+            <w:tcW w:type="dxa" w:w="1782"/>
             <w:tcMar>
               <w:top w:w="60" w:type="dxa"/>
               <w:bottom w:w="60" w:type="dxa"/>
-              <w:left w:w="100" w:type="dxa"/>
-              <w:right w:w="100" w:type="dxa"/>
+              <w:left w:w="80" w:type="dxa"/>
+              <w:right w:w="80" w:type="dxa"/>
             </w:tcMar>
-            <w:shd w:val="clear" w:color="auto" w:fill="EBF5FB"/>
+            <w:shd w:val="clear" w:color="auto" w:fill="D6E4F0"/>
           </w:tcPr>
           <w:p>
             <w:pPr>
@@ -1867,10 +1732,9 @@
               <w:rPr>
                 <w:rFonts w:ascii="Calibri" w:hAnsi="Calibri"/>
                 <w:b w:val="0"/>
-                <w:i w:val="0"/>
                 <w:sz w:val="20"/>
               </w:rPr>
-              <w:t>✅</w:t>
+              <w:t xml:space="preserve">Gerado</w:t>
             </w:r>
           </w:p>
         </w:tc>
@@ -1885,8 +1749,8 @@
             <w:tcMar>
               <w:top w:w="60" w:type="dxa"/>
               <w:bottom w:w="60" w:type="dxa"/>
-              <w:left w:w="100" w:type="dxa"/>
-              <w:right w:w="100" w:type="dxa"/>
+              <w:left w:w="80" w:type="dxa"/>
+              <w:right w:w="80" w:type="dxa"/>
             </w:tcMar>
           </w:tcPr>
           <w:p>
@@ -1897,10 +1761,9 @@
               <w:rPr>
                 <w:rFonts w:ascii="Calibri" w:hAnsi="Calibri"/>
                 <w:b w:val="0"/>
-                <w:i w:val="0"/>
                 <w:sz w:val="20"/>
               </w:rPr>
-              <w:t>8</w:t>
+              <w:t xml:space="preserve">8</w:t>
             </w:r>
           </w:p>
         </w:tc>
@@ -1910,8 +1773,8 @@
             <w:tcMar>
               <w:top w:w="60" w:type="dxa"/>
               <w:bottom w:w="60" w:type="dxa"/>
-              <w:left w:w="100" w:type="dxa"/>
-              <w:right w:w="100" w:type="dxa"/>
+              <w:left w:w="80" w:type="dxa"/>
+              <w:right w:w="80" w:type="dxa"/>
             </w:tcMar>
           </w:tcPr>
           <w:p>
@@ -1922,10 +1785,9 @@
               <w:rPr>
                 <w:rFonts w:ascii="Calibri" w:hAnsi="Calibri"/>
                 <w:b w:val="0"/>
-                <w:i w:val="0"/>
                 <w:sz w:val="20"/>
               </w:rPr>
-              <w:t>PCP-AASP01-001</w:t>
+              <w:t xml:space="preserve">PCP-AASP01-001</w:t>
             </w:r>
           </w:p>
         </w:tc>
@@ -1935,8 +1797,8 @@
             <w:tcMar>
               <w:top w:w="60" w:type="dxa"/>
               <w:bottom w:w="60" w:type="dxa"/>
-              <w:left w:w="100" w:type="dxa"/>
-              <w:right w:w="100" w:type="dxa"/>
+              <w:left w:w="80" w:type="dxa"/>
+              <w:right w:w="80" w:type="dxa"/>
             </w:tcMar>
           </w:tcPr>
           <w:p>
@@ -1947,10 +1809,9 @@
               <w:rPr>
                 <w:rFonts w:ascii="Calibri" w:hAnsi="Calibri"/>
                 <w:b w:val="0"/>
-                <w:i w:val="0"/>
                 <w:sz w:val="20"/>
               </w:rPr>
-              <w:t>Documento de Design</w:t>
+              <w:t xml:space="preserve">Documento de Design</w:t>
             </w:r>
           </w:p>
         </w:tc>
@@ -1960,8 +1821,8 @@
             <w:tcMar>
               <w:top w:w="60" w:type="dxa"/>
               <w:bottom w:w="60" w:type="dxa"/>
-              <w:left w:w="100" w:type="dxa"/>
-              <w:right w:w="100" w:type="dxa"/>
+              <w:left w:w="80" w:type="dxa"/>
+              <w:right w:w="80" w:type="dxa"/>
             </w:tcMar>
           </w:tcPr>
           <w:p>
@@ -1972,21 +1833,20 @@
               <w:rPr>
                 <w:rFonts w:ascii="Calibri" w:hAnsi="Calibri"/>
                 <w:b w:val="0"/>
-                <w:i w:val="0"/>
                 <w:sz w:val="20"/>
               </w:rPr>
-              <w:t>PCP</w:t>
+              <w:t xml:space="preserve">PCP</w:t>
             </w:r>
           </w:p>
         </w:tc>
         <w:tc>
           <w:tcPr>
-            <w:tcW w:type="dxa" w:w="1780"/>
+            <w:tcW w:type="dxa" w:w="1782"/>
             <w:tcMar>
               <w:top w:w="60" w:type="dxa"/>
               <w:bottom w:w="60" w:type="dxa"/>
-              <w:left w:w="100" w:type="dxa"/>
-              <w:right w:w="100" w:type="dxa"/>
+              <w:left w:w="80" w:type="dxa"/>
+              <w:right w:w="80" w:type="dxa"/>
             </w:tcMar>
           </w:tcPr>
           <w:p>
@@ -1997,10 +1857,9 @@
               <w:rPr>
                 <w:rFonts w:ascii="Calibri" w:hAnsi="Calibri"/>
                 <w:b w:val="0"/>
-                <w:i w:val="0"/>
                 <w:sz w:val="20"/>
               </w:rPr>
-              <w:t>✅</w:t>
+              <w:t xml:space="preserve">Gerado</w:t>
             </w:r>
           </w:p>
         </w:tc>
@@ -2015,10 +1874,10 @@
             <w:tcMar>
               <w:top w:w="60" w:type="dxa"/>
               <w:bottom w:w="60" w:type="dxa"/>
-              <w:left w:w="100" w:type="dxa"/>
-              <w:right w:w="100" w:type="dxa"/>
+              <w:left w:w="80" w:type="dxa"/>
+              <w:right w:w="80" w:type="dxa"/>
             </w:tcMar>
-            <w:shd w:val="clear" w:color="auto" w:fill="EBF5FB"/>
+            <w:shd w:val="clear" w:color="auto" w:fill="D6E4F0"/>
           </w:tcPr>
           <w:p>
             <w:pPr>
@@ -2028,10 +1887,9 @@
               <w:rPr>
                 <w:rFonts w:ascii="Calibri" w:hAnsi="Calibri"/>
                 <w:b w:val="0"/>
-                <w:i w:val="0"/>
                 <w:sz w:val="20"/>
               </w:rPr>
-              <w:t>9</w:t>
+              <w:t xml:space="preserve">9</w:t>
             </w:r>
           </w:p>
         </w:tc>
@@ -2041,10 +1899,10 @@
             <w:tcMar>
               <w:top w:w="60" w:type="dxa"/>
               <w:bottom w:w="60" w:type="dxa"/>
-              <w:left w:w="100" w:type="dxa"/>
-              <w:right w:w="100" w:type="dxa"/>
+              <w:left w:w="80" w:type="dxa"/>
+              <w:right w:w="80" w:type="dxa"/>
             </w:tcMar>
-            <w:shd w:val="clear" w:color="auto" w:fill="EBF5FB"/>
+            <w:shd w:val="clear" w:color="auto" w:fill="D6E4F0"/>
           </w:tcPr>
           <w:p>
             <w:pPr>
@@ -2054,10 +1912,9 @@
               <w:rPr>
                 <w:rFonts w:ascii="Calibri" w:hAnsi="Calibri"/>
                 <w:b w:val="0"/>
-                <w:i w:val="0"/>
                 <w:sz w:val="20"/>
               </w:rPr>
-              <w:t>GDE-AASP01-001</w:t>
+              <w:t xml:space="preserve">GDE-AASP01-001</w:t>
             </w:r>
           </w:p>
         </w:tc>
@@ -2067,10 +1924,10 @@
             <w:tcMar>
               <w:top w:w="60" w:type="dxa"/>
               <w:bottom w:w="60" w:type="dxa"/>
-              <w:left w:w="100" w:type="dxa"/>
-              <w:right w:w="100" w:type="dxa"/>
+              <w:left w:w="80" w:type="dxa"/>
+              <w:right w:w="80" w:type="dxa"/>
             </w:tcMar>
-            <w:shd w:val="clear" w:color="auto" w:fill="EBF5FB"/>
+            <w:shd w:val="clear" w:color="auto" w:fill="D6E4F0"/>
           </w:tcPr>
           <w:p>
             <w:pPr>
@@ -2080,10 +1937,9 @@
               <w:rPr>
                 <w:rFonts w:ascii="Calibri" w:hAnsi="Calibri"/>
                 <w:b w:val="0"/>
-                <w:i w:val="0"/>
                 <w:sz w:val="20"/>
               </w:rPr>
-              <w:t>Registro de Análise de Decisão</w:t>
+              <w:t xml:space="preserve">Registro de Análise de Decisão</w:t>
             </w:r>
           </w:p>
         </w:tc>
@@ -2093,10 +1949,10 @@
             <w:tcMar>
               <w:top w:w="60" w:type="dxa"/>
               <w:bottom w:w="60" w:type="dxa"/>
-              <w:left w:w="100" w:type="dxa"/>
-              <w:right w:w="100" w:type="dxa"/>
+              <w:left w:w="80" w:type="dxa"/>
+              <w:right w:w="80" w:type="dxa"/>
             </w:tcMar>
-            <w:shd w:val="clear" w:color="auto" w:fill="EBF5FB"/>
+            <w:shd w:val="clear" w:color="auto" w:fill="D6E4F0"/>
           </w:tcPr>
           <w:p>
             <w:pPr>
@@ -2106,23 +1962,22 @@
               <w:rPr>
                 <w:rFonts w:ascii="Calibri" w:hAnsi="Calibri"/>
                 <w:b w:val="0"/>
-                <w:i w:val="0"/>
                 <w:sz w:val="20"/>
               </w:rPr>
-              <w:t>GDE</w:t>
+              <w:t xml:space="preserve">GDE</w:t>
             </w:r>
           </w:p>
         </w:tc>
         <w:tc>
           <w:tcPr>
-            <w:tcW w:type="dxa" w:w="1780"/>
+            <w:tcW w:type="dxa" w:w="1782"/>
             <w:tcMar>
               <w:top w:w="60" w:type="dxa"/>
               <w:bottom w:w="60" w:type="dxa"/>
-              <w:left w:w="100" w:type="dxa"/>
-              <w:right w:w="100" w:type="dxa"/>
+              <w:left w:w="80" w:type="dxa"/>
+              <w:right w:w="80" w:type="dxa"/>
             </w:tcMar>
-            <w:shd w:val="clear" w:color="auto" w:fill="EBF5FB"/>
+            <w:shd w:val="clear" w:color="auto" w:fill="D6E4F0"/>
           </w:tcPr>
           <w:p>
             <w:pPr>
@@ -2132,10 +1987,9 @@
               <w:rPr>
                 <w:rFonts w:ascii="Calibri" w:hAnsi="Calibri"/>
                 <w:b w:val="0"/>
-                <w:i w:val="0"/>
                 <w:sz w:val="20"/>
               </w:rPr>
-              <w:t>✅</w:t>
+              <w:t xml:space="preserve">Gerado</w:t>
             </w:r>
           </w:p>
         </w:tc>
@@ -2150,8 +2004,8 @@
             <w:tcMar>
               <w:top w:w="60" w:type="dxa"/>
               <w:bottom w:w="60" w:type="dxa"/>
-              <w:left w:w="100" w:type="dxa"/>
-              <w:right w:w="100" w:type="dxa"/>
+              <w:left w:w="80" w:type="dxa"/>
+              <w:right w:w="80" w:type="dxa"/>
             </w:tcMar>
           </w:tcPr>
           <w:p>
@@ -2162,10 +2016,9 @@
               <w:rPr>
                 <w:rFonts w:ascii="Calibri" w:hAnsi="Calibri"/>
                 <w:b w:val="0"/>
-                <w:i w:val="0"/>
                 <w:sz w:val="20"/>
               </w:rPr>
-              <w:t>10</w:t>
+              <w:t xml:space="preserve">10</w:t>
             </w:r>
           </w:p>
         </w:tc>
@@ -2175,8 +2028,8 @@
             <w:tcMar>
               <w:top w:w="60" w:type="dxa"/>
               <w:bottom w:w="60" w:type="dxa"/>
-              <w:left w:w="100" w:type="dxa"/>
-              <w:right w:w="100" w:type="dxa"/>
+              <w:left w:w="80" w:type="dxa"/>
+              <w:right w:w="80" w:type="dxa"/>
             </w:tcMar>
           </w:tcPr>
           <w:p>
@@ -2187,10 +2040,9 @@
               <w:rPr>
                 <w:rFonts w:ascii="Calibri" w:hAnsi="Calibri"/>
                 <w:b w:val="0"/>
-                <w:i w:val="0"/>
                 <w:sz w:val="20"/>
               </w:rPr>
-              <w:t>ITP-AASP01-001</w:t>
+              <w:t xml:space="preserve">ITP-AASP01-001</w:t>
             </w:r>
           </w:p>
         </w:tc>
@@ -2200,8 +2052,8 @@
             <w:tcMar>
               <w:top w:w="60" w:type="dxa"/>
               <w:bottom w:w="60" w:type="dxa"/>
-              <w:left w:w="100" w:type="dxa"/>
-              <w:right w:w="100" w:type="dxa"/>
+              <w:left w:w="80" w:type="dxa"/>
+              <w:right w:w="80" w:type="dxa"/>
             </w:tcMar>
           </w:tcPr>
           <w:p>
@@ -2212,10 +2064,9 @@
               <w:rPr>
                 <w:rFonts w:ascii="Calibri" w:hAnsi="Calibri"/>
                 <w:b w:val="0"/>
-                <w:i w:val="0"/>
                 <w:sz w:val="20"/>
               </w:rPr>
-              <w:t>Estratégia de Integração</w:t>
+              <w:t xml:space="preserve">Estratégia de Integração</w:t>
             </w:r>
           </w:p>
         </w:tc>
@@ -2225,8 +2076,8 @@
             <w:tcMar>
               <w:top w:w="60" w:type="dxa"/>
               <w:bottom w:w="60" w:type="dxa"/>
-              <w:left w:w="100" w:type="dxa"/>
-              <w:right w:w="100" w:type="dxa"/>
+              <w:left w:w="80" w:type="dxa"/>
+              <w:right w:w="80" w:type="dxa"/>
             </w:tcMar>
           </w:tcPr>
           <w:p>
@@ -2237,21 +2088,20 @@
               <w:rPr>
                 <w:rFonts w:ascii="Calibri" w:hAnsi="Calibri"/>
                 <w:b w:val="0"/>
-                <w:i w:val="0"/>
                 <w:sz w:val="20"/>
               </w:rPr>
-              <w:t>ITP</w:t>
+              <w:t xml:space="preserve">ITP</w:t>
             </w:r>
           </w:p>
         </w:tc>
         <w:tc>
           <w:tcPr>
-            <w:tcW w:type="dxa" w:w="1780"/>
+            <w:tcW w:type="dxa" w:w="1782"/>
             <w:tcMar>
               <w:top w:w="60" w:type="dxa"/>
               <w:bottom w:w="60" w:type="dxa"/>
-              <w:left w:w="100" w:type="dxa"/>
-              <w:right w:w="100" w:type="dxa"/>
+              <w:left w:w="80" w:type="dxa"/>
+              <w:right w:w="80" w:type="dxa"/>
             </w:tcMar>
           </w:tcPr>
           <w:p>
@@ -2262,10 +2112,9 @@
               <w:rPr>
                 <w:rFonts w:ascii="Calibri" w:hAnsi="Calibri"/>
                 <w:b w:val="0"/>
-                <w:i w:val="0"/>
                 <w:sz w:val="20"/>
               </w:rPr>
-              <w:t>✅</w:t>
+              <w:t xml:space="preserve">Gerado</w:t>
             </w:r>
           </w:p>
         </w:tc>
@@ -2280,10 +2129,10 @@
             <w:tcMar>
               <w:top w:w="60" w:type="dxa"/>
               <w:bottom w:w="60" w:type="dxa"/>
-              <w:left w:w="100" w:type="dxa"/>
-              <w:right w:w="100" w:type="dxa"/>
+              <w:left w:w="80" w:type="dxa"/>
+              <w:right w:w="80" w:type="dxa"/>
             </w:tcMar>
-            <w:shd w:val="clear" w:color="auto" w:fill="EBF5FB"/>
+            <w:shd w:val="clear" w:color="auto" w:fill="D6E4F0"/>
           </w:tcPr>
           <w:p>
             <w:pPr>
@@ -2293,10 +2142,9 @@
               <w:rPr>
                 <w:rFonts w:ascii="Calibri" w:hAnsi="Calibri"/>
                 <w:b w:val="0"/>
-                <w:i w:val="0"/>
                 <w:sz w:val="20"/>
               </w:rPr>
-              <w:t>11</w:t>
+              <w:t xml:space="preserve">11</w:t>
             </w:r>
           </w:p>
         </w:tc>
@@ -2306,10 +2154,10 @@
             <w:tcMar>
               <w:top w:w="60" w:type="dxa"/>
               <w:bottom w:w="60" w:type="dxa"/>
-              <w:left w:w="100" w:type="dxa"/>
-              <w:right w:w="100" w:type="dxa"/>
+              <w:left w:w="80" w:type="dxa"/>
+              <w:right w:w="80" w:type="dxa"/>
             </w:tcMar>
-            <w:shd w:val="clear" w:color="auto" w:fill="EBF5FB"/>
+            <w:shd w:val="clear" w:color="auto" w:fill="D6E4F0"/>
           </w:tcPr>
           <w:p>
             <w:pPr>
@@ -2319,10 +2167,9 @@
               <w:rPr>
                 <w:rFonts w:ascii="Calibri" w:hAnsi="Calibri"/>
                 <w:b w:val="0"/>
-                <w:i w:val="0"/>
                 <w:sz w:val="20"/>
               </w:rPr>
-              <w:t>VV-AASP01-001</w:t>
+              <w:t xml:space="preserve">VV-AASP01-001</w:t>
             </w:r>
           </w:p>
         </w:tc>
@@ -2332,10 +2179,10 @@
             <w:tcMar>
               <w:top w:w="60" w:type="dxa"/>
               <w:bottom w:w="60" w:type="dxa"/>
-              <w:left w:w="100" w:type="dxa"/>
-              <w:right w:w="100" w:type="dxa"/>
+              <w:left w:w="80" w:type="dxa"/>
+              <w:right w:w="80" w:type="dxa"/>
             </w:tcMar>
-            <w:shd w:val="clear" w:color="auto" w:fill="EBF5FB"/>
+            <w:shd w:val="clear" w:color="auto" w:fill="D6E4F0"/>
           </w:tcPr>
           <w:p>
             <w:pPr>
@@ -2345,10 +2192,9 @@
               <w:rPr>
                 <w:rFonts w:ascii="Calibri" w:hAnsi="Calibri"/>
                 <w:b w:val="0"/>
-                <w:i w:val="0"/>
                 <w:sz w:val="20"/>
               </w:rPr>
-              <w:t>Plano de Verificação e Validação</w:t>
+              <w:t xml:space="preserve">Plano de Verificação e Validação</w:t>
             </w:r>
           </w:p>
         </w:tc>
@@ -2358,10 +2204,10 @@
             <w:tcMar>
               <w:top w:w="60" w:type="dxa"/>
               <w:bottom w:w="60" w:type="dxa"/>
-              <w:left w:w="100" w:type="dxa"/>
-              <w:right w:w="100" w:type="dxa"/>
+              <w:left w:w="80" w:type="dxa"/>
+              <w:right w:w="80" w:type="dxa"/>
             </w:tcMar>
-            <w:shd w:val="clear" w:color="auto" w:fill="EBF5FB"/>
+            <w:shd w:val="clear" w:color="auto" w:fill="D6E4F0"/>
           </w:tcPr>
           <w:p>
             <w:pPr>
@@ -2371,23 +2217,22 @@
               <w:rPr>
                 <w:rFonts w:ascii="Calibri" w:hAnsi="Calibri"/>
                 <w:b w:val="0"/>
-                <w:i w:val="0"/>
                 <w:sz w:val="20"/>
               </w:rPr>
-              <w:t>VV</w:t>
+              <w:t xml:space="preserve">VV</w:t>
             </w:r>
           </w:p>
         </w:tc>
         <w:tc>
           <w:tcPr>
-            <w:tcW w:type="dxa" w:w="1780"/>
+            <w:tcW w:type="dxa" w:w="1782"/>
             <w:tcMar>
               <w:top w:w="60" w:type="dxa"/>
               <w:bottom w:w="60" w:type="dxa"/>
-              <w:left w:w="100" w:type="dxa"/>
-              <w:right w:w="100" w:type="dxa"/>
+              <w:left w:w="80" w:type="dxa"/>
+              <w:right w:w="80" w:type="dxa"/>
             </w:tcMar>
-            <w:shd w:val="clear" w:color="auto" w:fill="EBF5FB"/>
+            <w:shd w:val="clear" w:color="auto" w:fill="D6E4F0"/>
           </w:tcPr>
           <w:p>
             <w:pPr>
@@ -2397,10 +2242,9 @@
               <w:rPr>
                 <w:rFonts w:ascii="Calibri" w:hAnsi="Calibri"/>
                 <w:b w:val="0"/>
-                <w:i w:val="0"/>
                 <w:sz w:val="20"/>
               </w:rPr>
-              <w:t>✅</w:t>
+              <w:t xml:space="preserve">Gerado</w:t>
             </w:r>
           </w:p>
         </w:tc>
@@ -2415,8 +2259,8 @@
             <w:tcMar>
               <w:top w:w="60" w:type="dxa"/>
               <w:bottom w:w="60" w:type="dxa"/>
-              <w:left w:w="100" w:type="dxa"/>
-              <w:right w:w="100" w:type="dxa"/>
+              <w:left w:w="80" w:type="dxa"/>
+              <w:right w:w="80" w:type="dxa"/>
             </w:tcMar>
           </w:tcPr>
           <w:p>
@@ -2427,10 +2271,9 @@
               <w:rPr>
                 <w:rFonts w:ascii="Calibri" w:hAnsi="Calibri"/>
                 <w:b w:val="0"/>
-                <w:i w:val="0"/>
                 <w:sz w:val="20"/>
               </w:rPr>
-              <w:t>12</w:t>
+              <w:t xml:space="preserve">12</w:t>
             </w:r>
           </w:p>
         </w:tc>
@@ -2440,8 +2283,8 @@
             <w:tcMar>
               <w:top w:w="60" w:type="dxa"/>
               <w:bottom w:w="60" w:type="dxa"/>
-              <w:left w:w="100" w:type="dxa"/>
-              <w:right w:w="100" w:type="dxa"/>
+              <w:left w:w="80" w:type="dxa"/>
+              <w:right w:w="80" w:type="dxa"/>
             </w:tcMar>
           </w:tcPr>
           <w:p>
@@ -2452,10 +2295,9 @@
               <w:rPr>
                 <w:rFonts w:ascii="Calibri" w:hAnsi="Calibri"/>
                 <w:b w:val="0"/>
-                <w:i w:val="0"/>
                 <w:sz w:val="20"/>
               </w:rPr>
-              <w:t>CTQ-AASP01-001</w:t>
+              <w:t xml:space="preserve">CTQ-AASP01-001</w:t>
             </w:r>
           </w:p>
         </w:tc>
@@ -2465,8 +2307,8 @@
             <w:tcMar>
               <w:top w:w="60" w:type="dxa"/>
               <w:bottom w:w="60" w:type="dxa"/>
-              <w:left w:w="100" w:type="dxa"/>
-              <w:right w:w="100" w:type="dxa"/>
+              <w:left w:w="80" w:type="dxa"/>
+              <w:right w:w="80" w:type="dxa"/>
             </w:tcMar>
           </w:tcPr>
           <w:p>
@@ -2477,10 +2319,9 @@
               <w:rPr>
                 <w:rFonts w:ascii="Calibri" w:hAnsi="Calibri"/>
                 <w:b w:val="0"/>
-                <w:i w:val="0"/>
                 <w:sz w:val="20"/>
               </w:rPr>
-              <w:t>Cenários de Teste e Homologação</w:t>
+              <w:t xml:space="preserve">Cenários de Teste e Homologação</w:t>
             </w:r>
           </w:p>
         </w:tc>
@@ -2490,8 +2331,8 @@
             <w:tcMar>
               <w:top w:w="60" w:type="dxa"/>
               <w:bottom w:w="60" w:type="dxa"/>
-              <w:left w:w="100" w:type="dxa"/>
-              <w:right w:w="100" w:type="dxa"/>
+              <w:left w:w="80" w:type="dxa"/>
+              <w:right w:w="80" w:type="dxa"/>
             </w:tcMar>
           </w:tcPr>
           <w:p>
@@ -2502,21 +2343,20 @@
               <w:rPr>
                 <w:rFonts w:ascii="Calibri" w:hAnsi="Calibri"/>
                 <w:b w:val="0"/>
-                <w:i w:val="0"/>
                 <w:sz w:val="20"/>
               </w:rPr>
-              <w:t>VV</w:t>
+              <w:t xml:space="preserve">VV</w:t>
             </w:r>
           </w:p>
         </w:tc>
         <w:tc>
           <w:tcPr>
-            <w:tcW w:type="dxa" w:w="1780"/>
+            <w:tcW w:type="dxa" w:w="1782"/>
             <w:tcMar>
               <w:top w:w="60" w:type="dxa"/>
               <w:bottom w:w="60" w:type="dxa"/>
-              <w:left w:w="100" w:type="dxa"/>
-              <w:right w:w="100" w:type="dxa"/>
+              <w:left w:w="80" w:type="dxa"/>
+              <w:right w:w="80" w:type="dxa"/>
             </w:tcMar>
           </w:tcPr>
           <w:p>
@@ -2527,10 +2367,9 @@
               <w:rPr>
                 <w:rFonts w:ascii="Calibri" w:hAnsi="Calibri"/>
                 <w:b w:val="0"/>
-                <w:i w:val="0"/>
                 <w:sz w:val="20"/>
               </w:rPr>
-              <w:t>✅</w:t>
+              <w:t xml:space="preserve">Gerado</w:t>
             </w:r>
           </w:p>
         </w:tc>
@@ -2545,10 +2384,10 @@
             <w:tcMar>
               <w:top w:w="60" w:type="dxa"/>
               <w:bottom w:w="60" w:type="dxa"/>
-              <w:left w:w="100" w:type="dxa"/>
-              <w:right w:w="100" w:type="dxa"/>
+              <w:left w:w="80" w:type="dxa"/>
+              <w:right w:w="80" w:type="dxa"/>
             </w:tcMar>
-            <w:shd w:val="clear" w:color="auto" w:fill="EBF5FB"/>
+            <w:shd w:val="clear" w:color="auto" w:fill="D6E4F0"/>
           </w:tcPr>
           <w:p>
             <w:pPr>
@@ -2558,10 +2397,9 @@
               <w:rPr>
                 <w:rFonts w:ascii="Calibri" w:hAnsi="Calibri"/>
                 <w:b w:val="0"/>
-                <w:i w:val="0"/>
                 <w:sz w:val="20"/>
               </w:rPr>
-              <w:t>13</w:t>
+              <w:t xml:space="preserve">13</w:t>
             </w:r>
           </w:p>
         </w:tc>
@@ -2571,10 +2409,10 @@
             <w:tcMar>
               <w:top w:w="60" w:type="dxa"/>
               <w:bottom w:w="60" w:type="dxa"/>
-              <w:left w:w="100" w:type="dxa"/>
-              <w:right w:w="100" w:type="dxa"/>
+              <w:left w:w="80" w:type="dxa"/>
+              <w:right w:w="80" w:type="dxa"/>
             </w:tcMar>
-            <w:shd w:val="clear" w:color="auto" w:fill="EBF5FB"/>
+            <w:shd w:val="clear" w:color="auto" w:fill="D6E4F0"/>
           </w:tcPr>
           <w:p>
             <w:pPr>
@@ -2584,10 +2422,9 @@
               <w:rPr>
                 <w:rFonts w:ascii="Calibri" w:hAnsi="Calibri"/>
                 <w:b w:val="0"/>
-                <w:i w:val="0"/>
                 <w:sz w:val="20"/>
               </w:rPr>
-              <w:t>REL-VV-AASP01-001</w:t>
+              <w:t xml:space="preserve">REL-VV-AASP01-001</w:t>
             </w:r>
           </w:p>
         </w:tc>
@@ -2597,10 +2434,10 @@
             <w:tcMar>
               <w:top w:w="60" w:type="dxa"/>
               <w:bottom w:w="60" w:type="dxa"/>
-              <w:left w:w="100" w:type="dxa"/>
-              <w:right w:w="100" w:type="dxa"/>
+              <w:left w:w="80" w:type="dxa"/>
+              <w:right w:w="80" w:type="dxa"/>
             </w:tcMar>
-            <w:shd w:val="clear" w:color="auto" w:fill="EBF5FB"/>
+            <w:shd w:val="clear" w:color="auto" w:fill="D6E4F0"/>
           </w:tcPr>
           <w:p>
             <w:pPr>
@@ -2610,10 +2447,9 @@
               <w:rPr>
                 <w:rFonts w:ascii="Calibri" w:hAnsi="Calibri"/>
                 <w:b w:val="0"/>
-                <w:i w:val="0"/>
                 <w:sz w:val="20"/>
               </w:rPr>
-              <w:t>Relatório de Execução de Testes</w:t>
+              <w:t xml:space="preserve">Relatório de Execução de Testes</w:t>
             </w:r>
           </w:p>
         </w:tc>
@@ -2623,10 +2459,10 @@
             <w:tcMar>
               <w:top w:w="60" w:type="dxa"/>
               <w:bottom w:w="60" w:type="dxa"/>
-              <w:left w:w="100" w:type="dxa"/>
-              <w:right w:w="100" w:type="dxa"/>
+              <w:left w:w="80" w:type="dxa"/>
+              <w:right w:w="80" w:type="dxa"/>
             </w:tcMar>
-            <w:shd w:val="clear" w:color="auto" w:fill="EBF5FB"/>
+            <w:shd w:val="clear" w:color="auto" w:fill="D6E4F0"/>
           </w:tcPr>
           <w:p>
             <w:pPr>
@@ -2636,23 +2472,22 @@
               <w:rPr>
                 <w:rFonts w:ascii="Calibri" w:hAnsi="Calibri"/>
                 <w:b w:val="0"/>
-                <w:i w:val="0"/>
                 <w:sz w:val="20"/>
               </w:rPr>
-              <w:t>VV</w:t>
+              <w:t xml:space="preserve">VV</w:t>
             </w:r>
           </w:p>
         </w:tc>
         <w:tc>
           <w:tcPr>
-            <w:tcW w:type="dxa" w:w="1780"/>
+            <w:tcW w:type="dxa" w:w="1782"/>
             <w:tcMar>
               <w:top w:w="60" w:type="dxa"/>
               <w:bottom w:w="60" w:type="dxa"/>
-              <w:left w:w="100" w:type="dxa"/>
-              <w:right w:w="100" w:type="dxa"/>
+              <w:left w:w="80" w:type="dxa"/>
+              <w:right w:w="80" w:type="dxa"/>
             </w:tcMar>
-            <w:shd w:val="clear" w:color="auto" w:fill="EBF5FB"/>
+            <w:shd w:val="clear" w:color="auto" w:fill="D6E4F0"/>
           </w:tcPr>
           <w:p>
             <w:pPr>
@@ -2662,10 +2497,9 @@
               <w:rPr>
                 <w:rFonts w:ascii="Calibri" w:hAnsi="Calibri"/>
                 <w:b w:val="0"/>
-                <w:i w:val="0"/>
                 <w:sz w:val="20"/>
               </w:rPr>
-              <w:t>✅</w:t>
+              <w:t xml:space="preserve">Gerado</w:t>
             </w:r>
           </w:p>
         </w:tc>
@@ -2680,8 +2514,8 @@
             <w:tcMar>
               <w:top w:w="60" w:type="dxa"/>
               <w:bottom w:w="60" w:type="dxa"/>
-              <w:left w:w="100" w:type="dxa"/>
-              <w:right w:w="100" w:type="dxa"/>
+              <w:left w:w="80" w:type="dxa"/>
+              <w:right w:w="80" w:type="dxa"/>
             </w:tcMar>
           </w:tcPr>
           <w:p>
@@ -2692,10 +2526,9 @@
               <w:rPr>
                 <w:rFonts w:ascii="Calibri" w:hAnsi="Calibri"/>
                 <w:b w:val="0"/>
-                <w:i w:val="0"/>
                 <w:sz w:val="20"/>
               </w:rPr>
-              <w:t>14</w:t>
+              <w:t xml:space="preserve">14</w:t>
             </w:r>
           </w:p>
         </w:tc>
@@ -2705,8 +2538,8 @@
             <w:tcMar>
               <w:top w:w="60" w:type="dxa"/>
               <w:bottom w:w="60" w:type="dxa"/>
-              <w:left w:w="100" w:type="dxa"/>
-              <w:right w:w="100" w:type="dxa"/>
+              <w:left w:w="80" w:type="dxa"/>
+              <w:right w:w="80" w:type="dxa"/>
             </w:tcMar>
           </w:tcPr>
           <w:p>
@@ -2717,10 +2550,9 @@
               <w:rPr>
                 <w:rFonts w:ascii="Calibri" w:hAnsi="Calibri"/>
                 <w:b w:val="0"/>
-                <w:i w:val="0"/>
                 <w:sz w:val="20"/>
               </w:rPr>
-              <w:t>REV-AASP01-001</w:t>
+              <w:t xml:space="preserve">REV-AASP01-001</w:t>
             </w:r>
           </w:p>
         </w:tc>
@@ -2730,8 +2562,8 @@
             <w:tcMar>
               <w:top w:w="60" w:type="dxa"/>
               <w:bottom w:w="60" w:type="dxa"/>
-              <w:left w:w="100" w:type="dxa"/>
-              <w:right w:w="100" w:type="dxa"/>
+              <w:left w:w="80" w:type="dxa"/>
+              <w:right w:w="80" w:type="dxa"/>
             </w:tcMar>
           </w:tcPr>
           <w:p>
@@ -2742,10 +2574,9 @@
               <w:rPr>
                 <w:rFonts w:ascii="Calibri" w:hAnsi="Calibri"/>
                 <w:b w:val="0"/>
-                <w:i w:val="0"/>
                 <w:sz w:val="20"/>
               </w:rPr>
-              <w:t>Registro de Revisão Técnica</w:t>
+              <w:t xml:space="preserve">Registro de Revisão Técnica</w:t>
             </w:r>
           </w:p>
         </w:tc>
@@ -2755,8 +2586,8 @@
             <w:tcMar>
               <w:top w:w="60" w:type="dxa"/>
               <w:bottom w:w="60" w:type="dxa"/>
-              <w:left w:w="100" w:type="dxa"/>
-              <w:right w:w="100" w:type="dxa"/>
+              <w:left w:w="80" w:type="dxa"/>
+              <w:right w:w="80" w:type="dxa"/>
             </w:tcMar>
           </w:tcPr>
           <w:p>
@@ -2767,21 +2598,20 @@
               <w:rPr>
                 <w:rFonts w:ascii="Calibri" w:hAnsi="Calibri"/>
                 <w:b w:val="0"/>
-                <w:i w:val="0"/>
                 <w:sz w:val="20"/>
               </w:rPr>
-              <w:t>VV</w:t>
+              <w:t xml:space="preserve">VV</w:t>
             </w:r>
           </w:p>
         </w:tc>
         <w:tc>
           <w:tcPr>
-            <w:tcW w:type="dxa" w:w="1780"/>
+            <w:tcW w:type="dxa" w:w="1782"/>
             <w:tcMar>
               <w:top w:w="60" w:type="dxa"/>
               <w:bottom w:w="60" w:type="dxa"/>
-              <w:left w:w="100" w:type="dxa"/>
-              <w:right w:w="100" w:type="dxa"/>
+              <w:left w:w="80" w:type="dxa"/>
+              <w:right w:w="80" w:type="dxa"/>
             </w:tcMar>
           </w:tcPr>
           <w:p>
@@ -2792,10 +2622,9 @@
               <w:rPr>
                 <w:rFonts w:ascii="Calibri" w:hAnsi="Calibri"/>
                 <w:b w:val="0"/>
-                <w:i w:val="0"/>
                 <w:sz w:val="20"/>
               </w:rPr>
-              <w:t>✅</w:t>
+              <w:t xml:space="preserve">Gerado</w:t>
             </w:r>
           </w:p>
         </w:tc>
@@ -2810,10 +2639,10 @@
             <w:tcMar>
               <w:top w:w="60" w:type="dxa"/>
               <w:bottom w:w="60" w:type="dxa"/>
-              <w:left w:w="100" w:type="dxa"/>
-              <w:right w:w="100" w:type="dxa"/>
+              <w:left w:w="80" w:type="dxa"/>
+              <w:right w:w="80" w:type="dxa"/>
             </w:tcMar>
-            <w:shd w:val="clear" w:color="auto" w:fill="EBF5FB"/>
+            <w:shd w:val="clear" w:color="auto" w:fill="D6E4F0"/>
           </w:tcPr>
           <w:p>
             <w:pPr>
@@ -2823,10 +2652,9 @@
               <w:rPr>
                 <w:rFonts w:ascii="Calibri" w:hAnsi="Calibri"/>
                 <w:b w:val="0"/>
-                <w:i w:val="0"/>
                 <w:sz w:val="20"/>
               </w:rPr>
-              <w:t>15</w:t>
+              <w:t xml:space="preserve">15</w:t>
             </w:r>
           </w:p>
         </w:tc>
@@ -2836,10 +2664,10 @@
             <w:tcMar>
               <w:top w:w="60" w:type="dxa"/>
               <w:bottom w:w="60" w:type="dxa"/>
-              <w:left w:w="100" w:type="dxa"/>
-              <w:right w:w="100" w:type="dxa"/>
+              <w:left w:w="80" w:type="dxa"/>
+              <w:right w:w="80" w:type="dxa"/>
             </w:tcMar>
-            <w:shd w:val="clear" w:color="auto" w:fill="EBF5FB"/>
+            <w:shd w:val="clear" w:color="auto" w:fill="D6E4F0"/>
           </w:tcPr>
           <w:p>
             <w:pPr>
@@ -2849,10 +2677,9 @@
               <w:rPr>
                 <w:rFonts w:ascii="Calibri" w:hAnsi="Calibri"/>
                 <w:b w:val="0"/>
-                <w:i w:val="0"/>
                 <w:sz w:val="20"/>
               </w:rPr>
-              <w:t>GCO-AASP01-001</w:t>
+              <w:t xml:space="preserve">GCO-AASP01-001</w:t>
             </w:r>
           </w:p>
         </w:tc>
@@ -2862,10 +2689,10 @@
             <w:tcMar>
               <w:top w:w="60" w:type="dxa"/>
               <w:bottom w:w="60" w:type="dxa"/>
-              <w:left w:w="100" w:type="dxa"/>
-              <w:right w:w="100" w:type="dxa"/>
+              <w:left w:w="80" w:type="dxa"/>
+              <w:right w:w="80" w:type="dxa"/>
             </w:tcMar>
-            <w:shd w:val="clear" w:color="auto" w:fill="EBF5FB"/>
+            <w:shd w:val="clear" w:color="auto" w:fill="D6E4F0"/>
           </w:tcPr>
           <w:p>
             <w:pPr>
@@ -2875,10 +2702,9 @@
               <w:rPr>
                 <w:rFonts w:ascii="Calibri" w:hAnsi="Calibri"/>
                 <w:b w:val="0"/>
-                <w:i w:val="0"/>
                 <w:sz w:val="20"/>
               </w:rPr>
-              <w:t>Registro de Gerência de Configuração</w:t>
+              <w:t xml:space="preserve">Registro de Gerência de Configuração</w:t>
             </w:r>
           </w:p>
         </w:tc>
@@ -2888,10 +2714,10 @@
             <w:tcMar>
               <w:top w:w="60" w:type="dxa"/>
               <w:bottom w:w="60" w:type="dxa"/>
-              <w:left w:w="100" w:type="dxa"/>
-              <w:right w:w="100" w:type="dxa"/>
+              <w:left w:w="80" w:type="dxa"/>
+              <w:right w:w="80" w:type="dxa"/>
             </w:tcMar>
-            <w:shd w:val="clear" w:color="auto" w:fill="EBF5FB"/>
+            <w:shd w:val="clear" w:color="auto" w:fill="D6E4F0"/>
           </w:tcPr>
           <w:p>
             <w:pPr>
@@ -2901,23 +2727,22 @@
               <w:rPr>
                 <w:rFonts w:ascii="Calibri" w:hAnsi="Calibri"/>
                 <w:b w:val="0"/>
-                <w:i w:val="0"/>
                 <w:sz w:val="20"/>
               </w:rPr>
-              <w:t>GCO</w:t>
+              <w:t xml:space="preserve">GCO</w:t>
             </w:r>
           </w:p>
         </w:tc>
         <w:tc>
           <w:tcPr>
-            <w:tcW w:type="dxa" w:w="1780"/>
+            <w:tcW w:type="dxa" w:w="1782"/>
             <w:tcMar>
               <w:top w:w="60" w:type="dxa"/>
               <w:bottom w:w="60" w:type="dxa"/>
-              <w:left w:w="100" w:type="dxa"/>
-              <w:right w:w="100" w:type="dxa"/>
+              <w:left w:w="80" w:type="dxa"/>
+              <w:right w:w="80" w:type="dxa"/>
             </w:tcMar>
-            <w:shd w:val="clear" w:color="auto" w:fill="EBF5FB"/>
+            <w:shd w:val="clear" w:color="auto" w:fill="D6E4F0"/>
           </w:tcPr>
           <w:p>
             <w:pPr>
@@ -2927,10 +2752,9 @@
               <w:rPr>
                 <w:rFonts w:ascii="Calibri" w:hAnsi="Calibri"/>
                 <w:b w:val="0"/>
-                <w:i w:val="0"/>
                 <w:sz w:val="20"/>
               </w:rPr>
-              <w:t>✅</w:t>
+              <w:t xml:space="preserve">Gerado</w:t>
             </w:r>
           </w:p>
         </w:tc>
@@ -2945,8 +2769,8 @@
             <w:tcMar>
               <w:top w:w="60" w:type="dxa"/>
               <w:bottom w:w="60" w:type="dxa"/>
-              <w:left w:w="100" w:type="dxa"/>
-              <w:right w:w="100" w:type="dxa"/>
+              <w:left w:w="80" w:type="dxa"/>
+              <w:right w:w="80" w:type="dxa"/>
             </w:tcMar>
           </w:tcPr>
           <w:p>
@@ -2957,10 +2781,9 @@
               <w:rPr>
                 <w:rFonts w:ascii="Calibri" w:hAnsi="Calibri"/>
                 <w:b w:val="0"/>
-                <w:i w:val="0"/>
                 <w:sz w:val="20"/>
               </w:rPr>
-              <w:t>16</w:t>
+              <w:t xml:space="preserve">16</w:t>
             </w:r>
           </w:p>
         </w:tc>
@@ -2970,8 +2793,8 @@
             <w:tcMar>
               <w:top w:w="60" w:type="dxa"/>
               <w:bottom w:w="60" w:type="dxa"/>
-              <w:left w:w="100" w:type="dxa"/>
-              <w:right w:w="100" w:type="dxa"/>
+              <w:left w:w="80" w:type="dxa"/>
+              <w:right w:w="80" w:type="dxa"/>
             </w:tcMar>
           </w:tcPr>
           <w:p>
@@ -2982,10 +2805,9 @@
               <w:rPr>
                 <w:rFonts w:ascii="Calibri" w:hAnsi="Calibri"/>
                 <w:b w:val="0"/>
-                <w:i w:val="0"/>
                 <w:sz w:val="20"/>
               </w:rPr>
-              <w:t>MED-AASP01-001</w:t>
+              <w:t xml:space="preserve">MED-AASP01-001</w:t>
             </w:r>
           </w:p>
         </w:tc>
@@ -2995,8 +2817,8 @@
             <w:tcMar>
               <w:top w:w="60" w:type="dxa"/>
               <w:bottom w:w="60" w:type="dxa"/>
-              <w:left w:w="100" w:type="dxa"/>
-              <w:right w:w="100" w:type="dxa"/>
+              <w:left w:w="80" w:type="dxa"/>
+              <w:right w:w="80" w:type="dxa"/>
             </w:tcMar>
           </w:tcPr>
           <w:p>
@@ -3007,10 +2829,9 @@
               <w:rPr>
                 <w:rFonts w:ascii="Calibri" w:hAnsi="Calibri"/>
                 <w:b w:val="0"/>
-                <w:i w:val="0"/>
                 <w:sz w:val="20"/>
               </w:rPr>
-              <w:t>Registro de Medição</w:t>
+              <w:t xml:space="preserve">Registro de Medição</w:t>
             </w:r>
           </w:p>
         </w:tc>
@@ -3020,8 +2841,8 @@
             <w:tcMar>
               <w:top w:w="60" w:type="dxa"/>
               <w:bottom w:w="60" w:type="dxa"/>
-              <w:left w:w="100" w:type="dxa"/>
-              <w:right w:w="100" w:type="dxa"/>
+              <w:left w:w="80" w:type="dxa"/>
+              <w:right w:w="80" w:type="dxa"/>
             </w:tcMar>
           </w:tcPr>
           <w:p>
@@ -3032,21 +2853,20 @@
               <w:rPr>
                 <w:rFonts w:ascii="Calibri" w:hAnsi="Calibri"/>
                 <w:b w:val="0"/>
-                <w:i w:val="0"/>
                 <w:sz w:val="20"/>
               </w:rPr>
-              <w:t>MED</w:t>
+              <w:t xml:space="preserve">MED</w:t>
             </w:r>
           </w:p>
         </w:tc>
         <w:tc>
           <w:tcPr>
-            <w:tcW w:type="dxa" w:w="1780"/>
+            <w:tcW w:type="dxa" w:w="1782"/>
             <w:tcMar>
               <w:top w:w="60" w:type="dxa"/>
               <w:bottom w:w="60" w:type="dxa"/>
-              <w:left w:w="100" w:type="dxa"/>
-              <w:right w:w="100" w:type="dxa"/>
+              <w:left w:w="80" w:type="dxa"/>
+              <w:right w:w="80" w:type="dxa"/>
             </w:tcMar>
           </w:tcPr>
           <w:p>
@@ -3057,10 +2877,9 @@
               <w:rPr>
                 <w:rFonts w:ascii="Calibri" w:hAnsi="Calibri"/>
                 <w:b w:val="0"/>
-                <w:i w:val="0"/>
                 <w:sz w:val="20"/>
               </w:rPr>
-              <w:t>✅</w:t>
+              <w:t xml:space="preserve">Gerado</w:t>
             </w:r>
           </w:p>
         </w:tc>
@@ -3075,10 +2894,10 @@
             <w:tcMar>
               <w:top w:w="60" w:type="dxa"/>
               <w:bottom w:w="60" w:type="dxa"/>
-              <w:left w:w="100" w:type="dxa"/>
-              <w:right w:w="100" w:type="dxa"/>
+              <w:left w:w="80" w:type="dxa"/>
+              <w:right w:w="80" w:type="dxa"/>
             </w:tcMar>
-            <w:shd w:val="clear" w:color="auto" w:fill="EBF5FB"/>
+            <w:shd w:val="clear" w:color="auto" w:fill="D6E4F0"/>
           </w:tcPr>
           <w:p>
             <w:pPr>
@@ -3088,10 +2907,9 @@
               <w:rPr>
                 <w:rFonts w:ascii="Calibri" w:hAnsi="Calibri"/>
                 <w:b w:val="0"/>
-                <w:i w:val="0"/>
                 <w:sz w:val="20"/>
               </w:rPr>
-              <w:t>17</w:t>
+              <w:t xml:space="preserve">17</w:t>
             </w:r>
           </w:p>
         </w:tc>
@@ -3101,10 +2919,10 @@
             <w:tcMar>
               <w:top w:w="60" w:type="dxa"/>
               <w:bottom w:w="60" w:type="dxa"/>
-              <w:left w:w="100" w:type="dxa"/>
-              <w:right w:w="100" w:type="dxa"/>
+              <w:left w:w="80" w:type="dxa"/>
+              <w:right w:w="80" w:type="dxa"/>
             </w:tcMar>
-            <w:shd w:val="clear" w:color="auto" w:fill="EBF5FB"/>
+            <w:shd w:val="clear" w:color="auto" w:fill="D6E4F0"/>
           </w:tcPr>
           <w:p>
             <w:pPr>
@@ -3114,10 +2932,9 @@
               <w:rPr>
                 <w:rFonts w:ascii="Calibri" w:hAnsi="Calibri"/>
                 <w:b w:val="0"/>
-                <w:i w:val="0"/>
                 <w:sz w:val="20"/>
               </w:rPr>
-              <w:t>CAP-AASP01-001</w:t>
+              <w:t xml:space="preserve">CAP-AASP01-001</w:t>
             </w:r>
           </w:p>
         </w:tc>
@@ -3127,10 +2944,10 @@
             <w:tcMar>
               <w:top w:w="60" w:type="dxa"/>
               <w:bottom w:w="60" w:type="dxa"/>
-              <w:left w:w="100" w:type="dxa"/>
-              <w:right w:w="100" w:type="dxa"/>
+              <w:left w:w="80" w:type="dxa"/>
+              <w:right w:w="80" w:type="dxa"/>
             </w:tcMar>
-            <w:shd w:val="clear" w:color="auto" w:fill="EBF5FB"/>
+            <w:shd w:val="clear" w:color="auto" w:fill="D6E4F0"/>
           </w:tcPr>
           <w:p>
             <w:pPr>
@@ -3140,10 +2957,9 @@
               <w:rPr>
                 <w:rFonts w:ascii="Calibri" w:hAnsi="Calibri"/>
                 <w:b w:val="0"/>
-                <w:i w:val="0"/>
                 <w:sz w:val="20"/>
               </w:rPr>
-              <w:t>Registro de Capacitação da Equipe</w:t>
+              <w:t xml:space="preserve">Registro de Capacitação da Equipe</w:t>
             </w:r>
           </w:p>
         </w:tc>
@@ -3153,10 +2969,10 @@
             <w:tcMar>
               <w:top w:w="60" w:type="dxa"/>
               <w:bottom w:w="60" w:type="dxa"/>
-              <w:left w:w="100" w:type="dxa"/>
-              <w:right w:w="100" w:type="dxa"/>
+              <w:left w:w="80" w:type="dxa"/>
+              <w:right w:w="80" w:type="dxa"/>
             </w:tcMar>
-            <w:shd w:val="clear" w:color="auto" w:fill="EBF5FB"/>
+            <w:shd w:val="clear" w:color="auto" w:fill="D6E4F0"/>
           </w:tcPr>
           <w:p>
             <w:pPr>
@@ -3166,23 +2982,22 @@
               <w:rPr>
                 <w:rFonts w:ascii="Calibri" w:hAnsi="Calibri"/>
                 <w:b w:val="0"/>
-                <w:i w:val="0"/>
                 <w:sz w:val="20"/>
               </w:rPr>
-              <w:t>CAP</w:t>
+              <w:t xml:space="preserve">CAP</w:t>
             </w:r>
           </w:p>
         </w:tc>
         <w:tc>
           <w:tcPr>
-            <w:tcW w:type="dxa" w:w="1780"/>
+            <w:tcW w:type="dxa" w:w="1782"/>
             <w:tcMar>
               <w:top w:w="60" w:type="dxa"/>
               <w:bottom w:w="60" w:type="dxa"/>
-              <w:left w:w="100" w:type="dxa"/>
-              <w:right w:w="100" w:type="dxa"/>
+              <w:left w:w="80" w:type="dxa"/>
+              <w:right w:w="80" w:type="dxa"/>
             </w:tcMar>
-            <w:shd w:val="clear" w:color="auto" w:fill="EBF5FB"/>
+            <w:shd w:val="clear" w:color="auto" w:fill="D6E4F0"/>
           </w:tcPr>
           <w:p>
             <w:pPr>
@@ -3192,10 +3007,9 @@
               <w:rPr>
                 <w:rFonts w:ascii="Calibri" w:hAnsi="Calibri"/>
                 <w:b w:val="0"/>
-                <w:i w:val="0"/>
                 <w:sz w:val="20"/>
               </w:rPr>
-              <w:t>✅</w:t>
+              <w:t xml:space="preserve">Gerado</w:t>
             </w:r>
           </w:p>
         </w:tc>
@@ -3210,8 +3024,8 @@
             <w:tcMar>
               <w:top w:w="60" w:type="dxa"/>
               <w:bottom w:w="60" w:type="dxa"/>
-              <w:left w:w="100" w:type="dxa"/>
-              <w:right w:w="100" w:type="dxa"/>
+              <w:left w:w="80" w:type="dxa"/>
+              <w:right w:w="80" w:type="dxa"/>
             </w:tcMar>
           </w:tcPr>
           <w:p>
@@ -3222,10 +3036,9 @@
               <w:rPr>
                 <w:rFonts w:ascii="Calibri" w:hAnsi="Calibri"/>
                 <w:b w:val="0"/>
-                <w:i w:val="0"/>
                 <w:sz w:val="20"/>
               </w:rPr>
-              <w:t>18</w:t>
+              <w:t xml:space="preserve">18</w:t>
             </w:r>
           </w:p>
         </w:tc>
@@ -3235,8 +3048,8 @@
             <w:tcMar>
               <w:top w:w="60" w:type="dxa"/>
               <w:bottom w:w="60" w:type="dxa"/>
-              <w:left w:w="100" w:type="dxa"/>
-              <w:right w:w="100" w:type="dxa"/>
+              <w:left w:w="80" w:type="dxa"/>
+              <w:right w:w="80" w:type="dxa"/>
             </w:tcMar>
           </w:tcPr>
           <w:p>
@@ -3247,10 +3060,9 @@
               <w:rPr>
                 <w:rFonts w:ascii="Calibri" w:hAnsi="Calibri"/>
                 <w:b w:val="0"/>
-                <w:i w:val="0"/>
                 <w:sz w:val="20"/>
               </w:rPr>
-              <w:t>GQA-AASP01-001</w:t>
+              <w:t xml:space="preserve">GQA-AASP01-001</w:t>
             </w:r>
           </w:p>
         </w:tc>
@@ -3260,8 +3072,8 @@
             <w:tcMar>
               <w:top w:w="60" w:type="dxa"/>
               <w:bottom w:w="60" w:type="dxa"/>
-              <w:left w:w="100" w:type="dxa"/>
-              <w:right w:w="100" w:type="dxa"/>
+              <w:left w:w="80" w:type="dxa"/>
+              <w:right w:w="80" w:type="dxa"/>
             </w:tcMar>
           </w:tcPr>
           <w:p>
@@ -3272,10 +3084,9 @@
               <w:rPr>
                 <w:rFonts w:ascii="Calibri" w:hAnsi="Calibri"/>
                 <w:b w:val="0"/>
-                <w:i w:val="0"/>
                 <w:sz w:val="20"/>
               </w:rPr>
-              <w:t>Registro de Verificação de GQA</w:t>
+              <w:t xml:space="preserve">Registro de Verificação de GQA</w:t>
             </w:r>
           </w:p>
         </w:tc>
@@ -3285,8 +3096,8 @@
             <w:tcMar>
               <w:top w:w="60" w:type="dxa"/>
               <w:bottom w:w="60" w:type="dxa"/>
-              <w:left w:w="100" w:type="dxa"/>
-              <w:right w:w="100" w:type="dxa"/>
+              <w:left w:w="80" w:type="dxa"/>
+              <w:right w:w="80" w:type="dxa"/>
             </w:tcMar>
           </w:tcPr>
           <w:p>
@@ -3297,21 +3108,20 @@
               <w:rPr>
                 <w:rFonts w:ascii="Calibri" w:hAnsi="Calibri"/>
                 <w:b w:val="0"/>
-                <w:i w:val="0"/>
                 <w:sz w:val="20"/>
               </w:rPr>
-              <w:t>GPC</w:t>
+              <w:t xml:space="preserve">GPC</w:t>
             </w:r>
           </w:p>
         </w:tc>
         <w:tc>
           <w:tcPr>
-            <w:tcW w:type="dxa" w:w="1780"/>
+            <w:tcW w:type="dxa" w:w="1782"/>
             <w:tcMar>
               <w:top w:w="60" w:type="dxa"/>
               <w:bottom w:w="60" w:type="dxa"/>
-              <w:left w:w="100" w:type="dxa"/>
-              <w:right w:w="100" w:type="dxa"/>
+              <w:left w:w="80" w:type="dxa"/>
+              <w:right w:w="80" w:type="dxa"/>
             </w:tcMar>
           </w:tcPr>
           <w:p>
@@ -3322,10 +3132,9 @@
               <w:rPr>
                 <w:rFonts w:ascii="Calibri" w:hAnsi="Calibri"/>
                 <w:b w:val="0"/>
-                <w:i w:val="0"/>
                 <w:sz w:val="20"/>
               </w:rPr>
-              <w:t>✅</w:t>
+              <w:t xml:space="preserve">Gerado</w:t>
             </w:r>
           </w:p>
         </w:tc>
@@ -3340,10 +3149,10 @@
             <w:tcMar>
               <w:top w:w="60" w:type="dxa"/>
               <w:bottom w:w="60" w:type="dxa"/>
-              <w:left w:w="100" w:type="dxa"/>
-              <w:right w:w="100" w:type="dxa"/>
+              <w:left w:w="80" w:type="dxa"/>
+              <w:right w:w="80" w:type="dxa"/>
             </w:tcMar>
-            <w:shd w:val="clear" w:color="auto" w:fill="EBF5FB"/>
+            <w:shd w:val="clear" w:color="auto" w:fill="D6E4F0"/>
           </w:tcPr>
           <w:p>
             <w:pPr>
@@ -3353,10 +3162,9 @@
               <w:rPr>
                 <w:rFonts w:ascii="Calibri" w:hAnsi="Calibri"/>
                 <w:b w:val="0"/>
-                <w:i w:val="0"/>
                 <w:sz w:val="20"/>
               </w:rPr>
-              <w:t>19</w:t>
+              <w:t xml:space="preserve">19</w:t>
             </w:r>
           </w:p>
         </w:tc>
@@ -3366,10 +3174,10 @@
             <w:tcMar>
               <w:top w:w="60" w:type="dxa"/>
               <w:bottom w:w="60" w:type="dxa"/>
-              <w:left w:w="100" w:type="dxa"/>
-              <w:right w:w="100" w:type="dxa"/>
+              <w:left w:w="80" w:type="dxa"/>
+              <w:right w:w="80" w:type="dxa"/>
             </w:tcMar>
-            <w:shd w:val="clear" w:color="auto" w:fill="EBF5FB"/>
+            <w:shd w:val="clear" w:color="auto" w:fill="D6E4F0"/>
           </w:tcPr>
           <w:p>
             <w:pPr>
@@ -3379,10 +3187,9 @@
               <w:rPr>
                 <w:rFonts w:ascii="Calibri" w:hAnsi="Calibri"/>
                 <w:b w:val="0"/>
-                <w:i w:val="0"/>
                 <w:sz w:val="20"/>
               </w:rPr>
-              <w:t>GEST-AASP01</w:t>
+              <w:t xml:space="preserve">GEST-AASP01</w:t>
             </w:r>
           </w:p>
         </w:tc>
@@ -3392,10 +3199,10 @@
             <w:tcMar>
               <w:top w:w="60" w:type="dxa"/>
               <w:bottom w:w="60" w:type="dxa"/>
-              <w:left w:w="100" w:type="dxa"/>
-              <w:right w:w="100" w:type="dxa"/>
+              <w:left w:w="80" w:type="dxa"/>
+              <w:right w:w="80" w:type="dxa"/>
             </w:tcMar>
-            <w:shd w:val="clear" w:color="auto" w:fill="EBF5FB"/>
+            <w:shd w:val="clear" w:color="auto" w:fill="D6E4F0"/>
           </w:tcPr>
           <w:p>
             <w:pPr>
@@ -3405,10 +3212,9 @@
               <w:rPr>
                 <w:rFonts w:ascii="Calibri" w:hAnsi="Calibri"/>
                 <w:b w:val="0"/>
-                <w:i w:val="0"/>
                 <w:sz w:val="20"/>
               </w:rPr>
-              <w:t>Planilha de Gestão do Projeto (xlsx)</w:t>
+              <w:t xml:space="preserve">Planilha de Gestão do Projeto (xlsx)</w:t>
             </w:r>
           </w:p>
         </w:tc>
@@ -3418,10 +3224,10 @@
             <w:tcMar>
               <w:top w:w="60" w:type="dxa"/>
               <w:bottom w:w="60" w:type="dxa"/>
-              <w:left w:w="100" w:type="dxa"/>
-              <w:right w:w="100" w:type="dxa"/>
+              <w:left w:w="80" w:type="dxa"/>
+              <w:right w:w="80" w:type="dxa"/>
             </w:tcMar>
-            <w:shd w:val="clear" w:color="auto" w:fill="EBF5FB"/>
+            <w:shd w:val="clear" w:color="auto" w:fill="D6E4F0"/>
           </w:tcPr>
           <w:p>
             <w:pPr>
@@ -3431,23 +3237,22 @@
               <w:rPr>
                 <w:rFonts w:ascii="Calibri" w:hAnsi="Calibri"/>
                 <w:b w:val="0"/>
-                <w:i w:val="0"/>
                 <w:sz w:val="20"/>
               </w:rPr>
-              <w:t>GPR</w:t>
+              <w:t xml:space="preserve">GPR</w:t>
             </w:r>
           </w:p>
         </w:tc>
         <w:tc>
           <w:tcPr>
-            <w:tcW w:type="dxa" w:w="1780"/>
+            <w:tcW w:type="dxa" w:w="1782"/>
             <w:tcMar>
               <w:top w:w="60" w:type="dxa"/>
               <w:bottom w:w="60" w:type="dxa"/>
-              <w:left w:w="100" w:type="dxa"/>
-              <w:right w:w="100" w:type="dxa"/>
+              <w:left w:w="80" w:type="dxa"/>
+              <w:right w:w="80" w:type="dxa"/>
             </w:tcMar>
-            <w:shd w:val="clear" w:color="auto" w:fill="EBF5FB"/>
+            <w:shd w:val="clear" w:color="auto" w:fill="D6E4F0"/>
           </w:tcPr>
           <w:p>
             <w:pPr>
@@ -3457,10 +3262,9 @@
               <w:rPr>
                 <w:rFonts w:ascii="Calibri" w:hAnsi="Calibri"/>
                 <w:b w:val="0"/>
-                <w:i w:val="0"/>
                 <w:sz w:val="20"/>
               </w:rPr>
-              <w:t>✅</w:t>
+              <w:t xml:space="preserve">Gerado</w:t>
             </w:r>
           </w:p>
         </w:tc>
@@ -3475,8 +3279,8 @@
             <w:tcMar>
               <w:top w:w="60" w:type="dxa"/>
               <w:bottom w:w="60" w:type="dxa"/>
-              <w:left w:w="100" w:type="dxa"/>
-              <w:right w:w="100" w:type="dxa"/>
+              <w:left w:w="80" w:type="dxa"/>
+              <w:right w:w="80" w:type="dxa"/>
             </w:tcMar>
           </w:tcPr>
           <w:p>
@@ -3487,10 +3291,9 @@
               <w:rPr>
                 <w:rFonts w:ascii="Calibri" w:hAnsi="Calibri"/>
                 <w:b w:val="0"/>
-                <w:i w:val="0"/>
                 <w:sz w:val="20"/>
               </w:rPr>
-              <w:t>20</w:t>
+              <w:t xml:space="preserve">20</w:t>
             </w:r>
           </w:p>
         </w:tc>
@@ -3500,8 +3303,8 @@
             <w:tcMar>
               <w:top w:w="60" w:type="dxa"/>
               <w:bottom w:w="60" w:type="dxa"/>
-              <w:left w:w="100" w:type="dxa"/>
-              <w:right w:w="100" w:type="dxa"/>
+              <w:left w:w="80" w:type="dxa"/>
+              <w:right w:w="80" w:type="dxa"/>
             </w:tcMar>
           </w:tcPr>
           <w:p>
@@ -3512,10 +3315,9 @@
               <w:rPr>
                 <w:rFonts w:ascii="Calibri" w:hAnsi="Calibri"/>
                 <w:b w:val="0"/>
-                <w:i w:val="0"/>
                 <w:sz w:val="20"/>
               </w:rPr>
-              <w:t>ATA-AASP01-001</w:t>
+              <w:t xml:space="preserve">ATA-AASP01-001</w:t>
             </w:r>
           </w:p>
         </w:tc>
@@ -3525,8 +3327,8 @@
             <w:tcMar>
               <w:top w:w="60" w:type="dxa"/>
               <w:bottom w:w="60" w:type="dxa"/>
-              <w:left w:w="100" w:type="dxa"/>
-              <w:right w:w="100" w:type="dxa"/>
+              <w:left w:w="80" w:type="dxa"/>
+              <w:right w:w="80" w:type="dxa"/>
             </w:tcMar>
           </w:tcPr>
           <w:p>
@@ -3537,10 +3339,9 @@
               <w:rPr>
                 <w:rFonts w:ascii="Calibri" w:hAnsi="Calibri"/>
                 <w:b w:val="0"/>
-                <w:i w:val="0"/>
                 <w:sz w:val="20"/>
               </w:rPr>
-              <w:t>Ata de Kickoff (19/05/2026)</w:t>
+              <w:t xml:space="preserve">Ata de Kickoff (19/05/2026)</w:t>
             </w:r>
           </w:p>
         </w:tc>
@@ -3550,8 +3351,8 @@
             <w:tcMar>
               <w:top w:w="60" w:type="dxa"/>
               <w:bottom w:w="60" w:type="dxa"/>
-              <w:left w:w="100" w:type="dxa"/>
-              <w:right w:w="100" w:type="dxa"/>
+              <w:left w:w="80" w:type="dxa"/>
+              <w:right w:w="80" w:type="dxa"/>
             </w:tcMar>
           </w:tcPr>
           <w:p>
@@ -3562,21 +3363,20 @@
               <w:rPr>
                 <w:rFonts w:ascii="Calibri" w:hAnsi="Calibri"/>
                 <w:b w:val="0"/>
-                <w:i w:val="0"/>
                 <w:sz w:val="20"/>
               </w:rPr>
-              <w:t>ORG</w:t>
+              <w:t xml:space="preserve">ORG</w:t>
             </w:r>
           </w:p>
         </w:tc>
         <w:tc>
           <w:tcPr>
-            <w:tcW w:type="dxa" w:w="1780"/>
+            <w:tcW w:type="dxa" w:w="1782"/>
             <w:tcMar>
               <w:top w:w="60" w:type="dxa"/>
               <w:bottom w:w="60" w:type="dxa"/>
-              <w:left w:w="100" w:type="dxa"/>
-              <w:right w:w="100" w:type="dxa"/>
+              <w:left w:w="80" w:type="dxa"/>
+              <w:right w:w="80" w:type="dxa"/>
             </w:tcMar>
           </w:tcPr>
           <w:p>
@@ -3587,10 +3387,9 @@
               <w:rPr>
                 <w:rFonts w:ascii="Calibri" w:hAnsi="Calibri"/>
                 <w:b w:val="0"/>
-                <w:i w:val="0"/>
                 <w:sz w:val="20"/>
               </w:rPr>
-              <w:t>✅</w:t>
+              <w:t xml:space="preserve">Gerado</w:t>
             </w:r>
           </w:p>
         </w:tc>
@@ -3605,10 +3404,10 @@
             <w:tcMar>
               <w:top w:w="60" w:type="dxa"/>
               <w:bottom w:w="60" w:type="dxa"/>
-              <w:left w:w="100" w:type="dxa"/>
-              <w:right w:w="100" w:type="dxa"/>
+              <w:left w:w="80" w:type="dxa"/>
+              <w:right w:w="80" w:type="dxa"/>
             </w:tcMar>
-            <w:shd w:val="clear" w:color="auto" w:fill="EBF5FB"/>
+            <w:shd w:val="clear" w:color="auto" w:fill="D6E4F0"/>
           </w:tcPr>
           <w:p>
             <w:pPr>
@@ -3618,10 +3417,9 @@
               <w:rPr>
                 <w:rFonts w:ascii="Calibri" w:hAnsi="Calibri"/>
                 <w:b w:val="0"/>
-                <w:i w:val="0"/>
                 <w:sz w:val="20"/>
               </w:rPr>
-              <w:t>21</w:t>
+              <w:t xml:space="preserve">21</w:t>
             </w:r>
           </w:p>
         </w:tc>
@@ -3631,10 +3429,10 @@
             <w:tcMar>
               <w:top w:w="60" w:type="dxa"/>
               <w:bottom w:w="60" w:type="dxa"/>
-              <w:left w:w="100" w:type="dxa"/>
-              <w:right w:w="100" w:type="dxa"/>
+              <w:left w:w="80" w:type="dxa"/>
+              <w:right w:w="80" w:type="dxa"/>
             </w:tcMar>
-            <w:shd w:val="clear" w:color="auto" w:fill="EBF5FB"/>
+            <w:shd w:val="clear" w:color="auto" w:fill="D6E4F0"/>
           </w:tcPr>
           <w:p>
             <w:pPr>
@@ -3644,10 +3442,9 @@
               <w:rPr>
                 <w:rFonts w:ascii="Calibri" w:hAnsi="Calibri"/>
                 <w:b w:val="0"/>
-                <w:i w:val="0"/>
                 <w:sz w:val="20"/>
               </w:rPr>
-              <w:t>ATA-AASP01-002</w:t>
+              <w:t xml:space="preserve">ATA-AASP01-002</w:t>
             </w:r>
           </w:p>
         </w:tc>
@@ -3657,10 +3454,10 @@
             <w:tcMar>
               <w:top w:w="60" w:type="dxa"/>
               <w:bottom w:w="60" w:type="dxa"/>
-              <w:left w:w="100" w:type="dxa"/>
-              <w:right w:w="100" w:type="dxa"/>
+              <w:left w:w="80" w:type="dxa"/>
+              <w:right w:w="80" w:type="dxa"/>
             </w:tcMar>
-            <w:shd w:val="clear" w:color="auto" w:fill="EBF5FB"/>
+            <w:shd w:val="clear" w:color="auto" w:fill="D6E4F0"/>
           </w:tcPr>
           <w:p>
             <w:pPr>
@@ -3670,10 +3467,9 @@
               <w:rPr>
                 <w:rFonts w:ascii="Calibri" w:hAnsi="Calibri"/>
                 <w:b w:val="0"/>
-                <w:i w:val="0"/>
                 <w:sz w:val="20"/>
               </w:rPr>
-              <w:t>Ata de Aceite — Sprint 1 (06/06/2026)</w:t>
+              <w:t xml:space="preserve">Ata de Aceite — Sprint 1 (06/06/2026)</w:t>
             </w:r>
           </w:p>
         </w:tc>
@@ -3683,10 +3479,10 @@
             <w:tcMar>
               <w:top w:w="60" w:type="dxa"/>
               <w:bottom w:w="60" w:type="dxa"/>
-              <w:left w:w="100" w:type="dxa"/>
-              <w:right w:w="100" w:type="dxa"/>
+              <w:left w:w="80" w:type="dxa"/>
+              <w:right w:w="80" w:type="dxa"/>
             </w:tcMar>
-            <w:shd w:val="clear" w:color="auto" w:fill="EBF5FB"/>
+            <w:shd w:val="clear" w:color="auto" w:fill="D6E4F0"/>
           </w:tcPr>
           <w:p>
             <w:pPr>
@@ -3696,23 +3492,22 @@
               <w:rPr>
                 <w:rFonts w:ascii="Calibri" w:hAnsi="Calibri"/>
                 <w:b w:val="0"/>
-                <w:i w:val="0"/>
                 <w:sz w:val="20"/>
               </w:rPr>
-              <w:t>ORG</w:t>
+              <w:t xml:space="preserve">ORG</w:t>
             </w:r>
           </w:p>
         </w:tc>
         <w:tc>
           <w:tcPr>
-            <w:tcW w:type="dxa" w:w="1780"/>
+            <w:tcW w:type="dxa" w:w="1782"/>
             <w:tcMar>
               <w:top w:w="60" w:type="dxa"/>
               <w:bottom w:w="60" w:type="dxa"/>
-              <w:left w:w="100" w:type="dxa"/>
-              <w:right w:w="100" w:type="dxa"/>
+              <w:left w:w="80" w:type="dxa"/>
+              <w:right w:w="80" w:type="dxa"/>
             </w:tcMar>
-            <w:shd w:val="clear" w:color="auto" w:fill="EBF5FB"/>
+            <w:shd w:val="clear" w:color="auto" w:fill="D6E4F0"/>
           </w:tcPr>
           <w:p>
             <w:pPr>
@@ -3722,10 +3517,9 @@
               <w:rPr>
                 <w:rFonts w:ascii="Calibri" w:hAnsi="Calibri"/>
                 <w:b w:val="0"/>
-                <w:i w:val="0"/>
                 <w:sz w:val="20"/>
               </w:rPr>
-              <w:t>✅</w:t>
+              <w:t xml:space="preserve">Gerado</w:t>
             </w:r>
           </w:p>
         </w:tc>
@@ -3740,8 +3534,8 @@
             <w:tcMar>
               <w:top w:w="60" w:type="dxa"/>
               <w:bottom w:w="60" w:type="dxa"/>
-              <w:left w:w="100" w:type="dxa"/>
-              <w:right w:w="100" w:type="dxa"/>
+              <w:left w:w="80" w:type="dxa"/>
+              <w:right w:w="80" w:type="dxa"/>
             </w:tcMar>
           </w:tcPr>
           <w:p>
@@ -3752,10 +3546,9 @@
               <w:rPr>
                 <w:rFonts w:ascii="Calibri" w:hAnsi="Calibri"/>
                 <w:b w:val="0"/>
-                <w:i w:val="0"/>
                 <w:sz w:val="20"/>
               </w:rPr>
-              <w:t>22</w:t>
+              <w:t xml:space="preserve">22</w:t>
             </w:r>
           </w:p>
         </w:tc>
@@ -3765,8 +3558,8 @@
             <w:tcMar>
               <w:top w:w="60" w:type="dxa"/>
               <w:bottom w:w="60" w:type="dxa"/>
-              <w:left w:w="100" w:type="dxa"/>
-              <w:right w:w="100" w:type="dxa"/>
+              <w:left w:w="80" w:type="dxa"/>
+              <w:right w:w="80" w:type="dxa"/>
             </w:tcMar>
           </w:tcPr>
           <w:p>
@@ -3777,10 +3570,9 @@
               <w:rPr>
                 <w:rFonts w:ascii="Calibri" w:hAnsi="Calibri"/>
                 <w:b w:val="0"/>
-                <w:i w:val="0"/>
                 <w:sz w:val="20"/>
               </w:rPr>
-              <w:t>TAE-AASP01-001</w:t>
+              <w:t xml:space="preserve">TAE-AASP01-001</w:t>
             </w:r>
           </w:p>
         </w:tc>
@@ -3790,8 +3582,8 @@
             <w:tcMar>
               <w:top w:w="60" w:type="dxa"/>
               <w:bottom w:w="60" w:type="dxa"/>
-              <w:left w:w="100" w:type="dxa"/>
-              <w:right w:w="100" w:type="dxa"/>
+              <w:left w:w="80" w:type="dxa"/>
+              <w:right w:w="80" w:type="dxa"/>
             </w:tcMar>
           </w:tcPr>
           <w:p>
@@ -3802,10 +3594,9 @@
               <w:rPr>
                 <w:rFonts w:ascii="Calibri" w:hAnsi="Calibri"/>
                 <w:b w:val="0"/>
-                <w:i w:val="0"/>
                 <w:sz w:val="20"/>
               </w:rPr>
-              <w:t>Termo de Encerramento e Aceite</w:t>
+              <w:t xml:space="preserve">Termo de Encerramento e Aceite</w:t>
             </w:r>
           </w:p>
         </w:tc>
@@ -3815,8 +3606,8 @@
             <w:tcMar>
               <w:top w:w="60" w:type="dxa"/>
               <w:bottom w:w="60" w:type="dxa"/>
-              <w:left w:w="100" w:type="dxa"/>
-              <w:right w:w="100" w:type="dxa"/>
+              <w:left w:w="80" w:type="dxa"/>
+              <w:right w:w="80" w:type="dxa"/>
             </w:tcMar>
           </w:tcPr>
           <w:p>
@@ -3827,21 +3618,20 @@
               <w:rPr>
                 <w:rFonts w:ascii="Calibri" w:hAnsi="Calibri"/>
                 <w:b w:val="0"/>
-                <w:i w:val="0"/>
                 <w:sz w:val="20"/>
               </w:rPr>
-              <w:t>GPR</w:t>
+              <w:t xml:space="preserve">GPR</w:t>
             </w:r>
           </w:p>
         </w:tc>
         <w:tc>
           <w:tcPr>
-            <w:tcW w:type="dxa" w:w="1780"/>
+            <w:tcW w:type="dxa" w:w="1782"/>
             <w:tcMar>
               <w:top w:w="60" w:type="dxa"/>
               <w:bottom w:w="60" w:type="dxa"/>
-              <w:left w:w="100" w:type="dxa"/>
-              <w:right w:w="100" w:type="dxa"/>
+              <w:left w:w="80" w:type="dxa"/>
+              <w:right w:w="80" w:type="dxa"/>
             </w:tcMar>
           </w:tcPr>
           <w:p>
@@ -3852,10 +3642,9 @@
               <w:rPr>
                 <w:rFonts w:ascii="Calibri" w:hAnsi="Calibri"/>
                 <w:b w:val="0"/>
-                <w:i w:val="0"/>
                 <w:sz w:val="20"/>
               </w:rPr>
-              <w:t>⏳ Sprint 4</w:t>
+              <w:t xml:space="preserve">Previsto — Sprint 3 (encerramento)</w:t>
             </w:r>
           </w:p>
         </w:tc>
@@ -3870,10 +3659,10 @@
             <w:tcMar>
               <w:top w:w="60" w:type="dxa"/>
               <w:bottom w:w="60" w:type="dxa"/>
-              <w:left w:w="100" w:type="dxa"/>
-              <w:right w:w="100" w:type="dxa"/>
+              <w:left w:w="80" w:type="dxa"/>
+              <w:right w:w="80" w:type="dxa"/>
             </w:tcMar>
-            <w:shd w:val="clear" w:color="auto" w:fill="EBF5FB"/>
+            <w:shd w:val="clear" w:color="auto" w:fill="D6E4F0"/>
           </w:tcPr>
           <w:p>
             <w:pPr>
@@ -3883,10 +3672,9 @@
               <w:rPr>
                 <w:rFonts w:ascii="Calibri" w:hAnsi="Calibri"/>
                 <w:b w:val="0"/>
-                <w:i w:val="0"/>
                 <w:sz w:val="20"/>
               </w:rPr>
-              <w:t>23</w:t>
+              <w:t xml:space="preserve">23</w:t>
             </w:r>
           </w:p>
         </w:tc>
@@ -3896,10 +3684,10 @@
             <w:tcMar>
               <w:top w:w="60" w:type="dxa"/>
               <w:bottom w:w="60" w:type="dxa"/>
-              <w:left w:w="100" w:type="dxa"/>
-              <w:right w:w="100" w:type="dxa"/>
+              <w:left w:w="80" w:type="dxa"/>
+              <w:right w:w="80" w:type="dxa"/>
             </w:tcMar>
-            <w:shd w:val="clear" w:color="auto" w:fill="EBF5FB"/>
+            <w:shd w:val="clear" w:color="auto" w:fill="D6E4F0"/>
           </w:tcPr>
           <w:p>
             <w:pPr>
@@ -3909,10 +3697,9 @@
               <w:rPr>
                 <w:rFonts w:ascii="Calibri" w:hAnsi="Calibri"/>
                 <w:b w:val="0"/>
-                <w:i w:val="0"/>
                 <w:sz w:val="20"/>
               </w:rPr>
-              <w:t>LI-AASP01-001</w:t>
+              <w:t xml:space="preserve">LI-AASP01-001</w:t>
             </w:r>
           </w:p>
         </w:tc>
@@ -3922,10 +3709,10 @@
             <w:tcMar>
               <w:top w:w="60" w:type="dxa"/>
               <w:bottom w:w="60" w:type="dxa"/>
-              <w:left w:w="100" w:type="dxa"/>
-              <w:right w:w="100" w:type="dxa"/>
+              <w:left w:w="80" w:type="dxa"/>
+              <w:right w:w="80" w:type="dxa"/>
             </w:tcMar>
-            <w:shd w:val="clear" w:color="auto" w:fill="EBF5FB"/>
+            <w:shd w:val="clear" w:color="auto" w:fill="D6E4F0"/>
           </w:tcPr>
           <w:p>
             <w:pPr>
@@ -3935,10 +3722,9 @@
               <w:rPr>
                 <w:rFonts w:ascii="Calibri" w:hAnsi="Calibri"/>
                 <w:b w:val="0"/>
-                <w:i w:val="0"/>
                 <w:sz w:val="20"/>
               </w:rPr>
-              <w:t>Lições Aprendidas</w:t>
+              <w:t xml:space="preserve">Lições Aprendidas</w:t>
             </w:r>
           </w:p>
         </w:tc>
@@ -3948,10 +3734,10 @@
             <w:tcMar>
               <w:top w:w="60" w:type="dxa"/>
               <w:bottom w:w="60" w:type="dxa"/>
-              <w:left w:w="100" w:type="dxa"/>
-              <w:right w:w="100" w:type="dxa"/>
+              <w:left w:w="80" w:type="dxa"/>
+              <w:right w:w="80" w:type="dxa"/>
             </w:tcMar>
-            <w:shd w:val="clear" w:color="auto" w:fill="EBF5FB"/>
+            <w:shd w:val="clear" w:color="auto" w:fill="D6E4F0"/>
           </w:tcPr>
           <w:p>
             <w:pPr>
@@ -3961,23 +3747,22 @@
               <w:rPr>
                 <w:rFonts w:ascii="Calibri" w:hAnsi="Calibri"/>
                 <w:b w:val="0"/>
-                <w:i w:val="0"/>
                 <w:sz w:val="20"/>
               </w:rPr>
-              <w:t>GPR</w:t>
+              <w:t xml:space="preserve">GPR</w:t>
             </w:r>
           </w:p>
         </w:tc>
         <w:tc>
           <w:tcPr>
-            <w:tcW w:type="dxa" w:w="1780"/>
+            <w:tcW w:type="dxa" w:w="1782"/>
             <w:tcMar>
               <w:top w:w="60" w:type="dxa"/>
               <w:bottom w:w="60" w:type="dxa"/>
-              <w:left w:w="100" w:type="dxa"/>
-              <w:right w:w="100" w:type="dxa"/>
+              <w:left w:w="80" w:type="dxa"/>
+              <w:right w:w="80" w:type="dxa"/>
             </w:tcMar>
-            <w:shd w:val="clear" w:color="auto" w:fill="EBF5FB"/>
+            <w:shd w:val="clear" w:color="auto" w:fill="D6E4F0"/>
           </w:tcPr>
           <w:p>
             <w:pPr>
@@ -3987,10 +3772,9 @@
               <w:rPr>
                 <w:rFonts w:ascii="Calibri" w:hAnsi="Calibri"/>
                 <w:b w:val="0"/>
-                <w:i w:val="0"/>
                 <w:sz w:val="20"/>
               </w:rPr>
-              <w:t>⏳ Sprint 4</w:t>
+              <w:t xml:space="preserve">Previsto — Sprint 3 (encerramento)</w:t>
             </w:r>
           </w:p>
         </w:tc>
@@ -3998,173 +3782,78 @@
     </w:tbl>
     <w:p>
       <w:pPr>
-        <w:spacing w:before="0" w:after="160"/>
-      </w:pPr>
-    </w:p>
-    <w:p>
-      <w:pPr>
-        <w:spacing w:before="40" w:after="120"/>
-        <w:ind w:left="454"/>
-        <w:pBdr>
-          <w:left w:val="single" w:sz="12" w:space="8" w:color="003366"/>
-        </w:pBdr>
+        <w:spacing w:before="80" w:after="80"/>
+        <w:ind w:left="720"/>
       </w:pPr>
       <w:r>
         <w:rPr>
           <w:rFonts w:ascii="Calibri" w:hAnsi="Calibri"/>
-          <w:b/>
-          <w:i w:val="0"/>
-          <w:color w:val="1A5276"/>
-          <w:sz w:val="22"/>
+          <w:i/>
+          <w:color w:val="555555"/>
+          <w:sz w:val="20"/>
         </w:rPr>
-        <w:t>Aquisição (AQU):</w:t>
-      </w:r>
-      <w:r>
-        <w:rPr>
-          <w:rFonts w:ascii="Calibri" w:hAnsi="Calibri"/>
-          <w:b w:val="0"/>
-          <w:i w:val="0"/>
-          <w:color w:val="1A5276"/>
-          <w:sz w:val="22"/>
-        </w:rPr>
-        <w:t xml:space="preserve"> não aplicável — não houve subcontratação de desenvolvimento (equipe própria Timeware). Insumos de serviço (APIs e ambientes do cliente) são tratados em ITP-AASP01-001 e nos riscos do PLA-AASP01-001.</w:t>
+        <w:t xml:space="preserve">Aquisição (AQU): não aplicável — não houve subcontratação de desenvolvimento (equipe própria Timeware). Insumos de serviço (APIs e ambientes do cliente) são tratados em ITP-AASP01-001 e nos riscos do PLA-AASP01-001.</w:t>
       </w:r>
     </w:p>
     <w:p>
       <w:pPr>
-        <w:pStyle w:val="Heading1"/>
-        <w:keepNext/>
-        <w:keepLines/>
-        <w:pBdr>
-          <w:bottom w:val="single" w:sz="4" w:space="2" w:color="D6E4F0"/>
-        </w:pBdr>
+        <w:pStyle w:val="Heading2"/>
       </w:pPr>
       <w:r>
-        <w:t>3. Observações de classificação</w:t>
+        <w:rPr>
+          <w:rFonts w:ascii="Calibri" w:hAnsi="Calibri"/>
+        </w:rPr>
+        <w:t>3. Observações de Classificação</w:t>
       </w:r>
     </w:p>
     <w:p>
       <w:pPr>
-        <w:pStyle w:val="ListBullet"/>
-        <w:spacing w:before="20" w:after="40"/>
+        <w:pStyle w:val="ListParagraph"/>
+        <w:numPr>
+          <w:ilvl w:val="0"/>
+          <w:numId w:val="1"/>
+        </w:numPr>
+        <w:ind w:left="720" w:hanging="360"/>
       </w:pPr>
       <w:r>
         <w:rPr>
           <w:rFonts w:ascii="Calibri" w:hAnsi="Calibri"/>
-          <w:b/>
-          <w:i w:val="0"/>
-          <w:sz w:val="22"/>
-        </w:rPr>
-        <w:t>Formato:</w:t>
-      </w:r>
-      <w:r>
-        <w:rPr>
-          <w:rFonts w:ascii="Calibri" w:hAnsi="Calibri"/>
-          <w:b w:val="0"/>
-          <w:i w:val="0"/>
-          <w:sz w:val="22"/>
-        </w:rPr>
-        <w:t xml:space="preserve"> registros produzidos em Markdown (</w:t>
-      </w:r>
-      <w:r>
-        <w:rPr>
-          <w:rFonts w:ascii="Courier New" w:hAnsi="Courier New"/>
-          <w:b w:val="0"/>
-          <w:i w:val="0"/>
-          <w:color w:val="333333"/>
           <w:sz w:val="20"/>
         </w:rPr>
-        <w:t>.md</w:t>
-      </w:r>
-      <w:r>
-        <w:rPr>
-          <w:rFonts w:ascii="Calibri" w:hAnsi="Calibri"/>
-          <w:b w:val="0"/>
-          <w:i w:val="0"/>
-          <w:sz w:val="22"/>
-        </w:rPr>
-        <w:t>) e convertidos para Word (</w:t>
-      </w:r>
-      <w:r>
-        <w:rPr>
-          <w:rFonts w:ascii="Courier New" w:hAnsi="Courier New"/>
-          <w:b w:val="0"/>
-          <w:i w:val="0"/>
-          <w:color w:val="333333"/>
-          <w:sz w:val="20"/>
-        </w:rPr>
-        <w:t>.docx</w:t>
-      </w:r>
-      <w:r>
-        <w:rPr>
-          <w:rFonts w:ascii="Calibri" w:hAnsi="Calibri"/>
-          <w:b w:val="0"/>
-          <w:i w:val="0"/>
-          <w:sz w:val="22"/>
-        </w:rPr>
-        <w:t xml:space="preserve">); planilha de gestão em </w:t>
-      </w:r>
-      <w:r>
-        <w:rPr>
-          <w:rFonts w:ascii="Courier New" w:hAnsi="Courier New"/>
-          <w:b w:val="0"/>
-          <w:i w:val="0"/>
-          <w:color w:val="333333"/>
-          <w:sz w:val="20"/>
-        </w:rPr>
-        <w:t>.xlsx</w:t>
-      </w:r>
-      <w:r>
-        <w:rPr>
-          <w:rFonts w:ascii="Calibri" w:hAnsi="Calibri"/>
-          <w:b w:val="0"/>
-          <w:i w:val="0"/>
-          <w:sz w:val="22"/>
-        </w:rPr>
-        <w:t>.</w:t>
+        <w:t xml:space="preserve">Formato: registros produzidos em Markdown (.md) e convertidos para Word (.docx); planilha de gestão em .xlsx.</w:t>
       </w:r>
     </w:p>
     <w:p>
       <w:pPr>
-        <w:pStyle w:val="ListBullet"/>
-        <w:spacing w:before="20" w:after="40"/>
+        <w:pStyle w:val="ListParagraph"/>
+        <w:numPr>
+          <w:ilvl w:val="0"/>
+          <w:numId w:val="1"/>
+        </w:numPr>
+        <w:ind w:left="720" w:hanging="360"/>
       </w:pPr>
       <w:r>
         <w:rPr>
           <w:rFonts w:ascii="Calibri" w:hAnsi="Calibri"/>
-          <w:b/>
-          <w:i w:val="0"/>
-          <w:sz w:val="22"/>
+          <w:sz w:val="20"/>
         </w:rPr>
-        <w:t>Nomes reais nos registros:</w:t>
-      </w:r>
-      <w:r>
-        <w:rPr>
-          <w:rFonts w:ascii="Calibri" w:hAnsi="Calibri"/>
-          <w:b w:val="0"/>
-          <w:i w:val="0"/>
-          <w:sz w:val="22"/>
-        </w:rPr>
-        <w:t xml:space="preserve"> os registros de identificação e de capacidade (TAP, PLA, ATAs, GQA, CAP) nominam a equipe real, conforme a camada de capacidade do modelo.</w:t>
+        <w:t xml:space="preserve">Nomes reais nos registros: os registros de identificação e de capacidade (TAP, PLA, ATAs, GQA, CAP) nominam a equipe real, conforme a camada de capacidade do modelo.</w:t>
       </w:r>
     </w:p>
     <w:p>
       <w:pPr>
-        <w:pStyle w:val="Heading1"/>
-        <w:keepNext/>
-        <w:keepLines/>
-        <w:pBdr>
-          <w:bottom w:val="single" w:sz="4" w:space="2" w:color="D6E4F0"/>
-        </w:pBdr>
+        <w:pStyle w:val="Heading2"/>
       </w:pPr>
       <w:r>
+        <w:rPr>
+          <w:rFonts w:ascii="Calibri" w:hAnsi="Calibri"/>
+        </w:rPr>
         <w:t>Histórico de Revisões</w:t>
       </w:r>
     </w:p>
     <w:tbl>
       <w:tblPr>
         <w:tblW w:type="auto" w:w="0"/>
-        <w:tblLook w:firstColumn="1" w:firstRow="1" w:lastColumn="0" w:lastRow="0" w:noHBand="0" w:noVBand="1" w:val="04A0"/>
         <w:tblBorders>
           <w:top w:val="single" w:sz="4" w:space="0" w:color="AAAAAA"/>
           <w:left w:val="single" w:sz="4" w:space="0" w:color="AAAAAA"/>
@@ -4175,23 +3864,133 @@
         </w:tblBorders>
       </w:tblPr>
       <w:tblGrid>
-        <w:gridCol w:w="2225"/>
-        <w:gridCol w:w="2225"/>
-        <w:gridCol w:w="2225"/>
-        <w:gridCol w:w="2225"/>
+        <w:gridCol w:w="1200"/>
+        <w:gridCol w:w="1400"/>
+        <w:gridCol w:w="1800"/>
+        <w:gridCol w:w="4502"/>
       </w:tblGrid>
+      <w:tr>
+        <w:trPr>
+          <w:tblHeader/>
+          <w:cantSplit w:val="1"/>
+        </w:trPr>
+        <w:tc>
+          <w:tcPr>
+            <w:tcW w:type="dxa" w:w="1200"/>
+            <w:tcMar>
+              <w:top w:w="60" w:type="dxa"/>
+              <w:bottom w:w="60" w:type="dxa"/>
+              <w:left w:w="80" w:type="dxa"/>
+              <w:right w:w="80" w:type="dxa"/>
+            </w:tcMar>
+            <w:shd w:val="clear" w:color="auto" w:fill="1F3864"/>
+          </w:tcPr>
+          <w:p>
+            <w:pPr>
+              <w:spacing w:before="40" w:after="40"/>
+            </w:pPr>
+            <w:r>
+              <w:rPr>
+                <w:rFonts w:ascii="Calibri" w:hAnsi="Calibri"/>
+                <w:b/>
+                <w:color w:val="FFFFFF"/>
+                <w:sz w:val="20"/>
+              </w:rPr>
+              <w:t xml:space="preserve">Versão</w:t>
+            </w:r>
+          </w:p>
+        </w:tc>
+        <w:tc>
+          <w:tcPr>
+            <w:tcW w:type="dxa" w:w="1400"/>
+            <w:tcMar>
+              <w:top w:w="60" w:type="dxa"/>
+              <w:bottom w:w="60" w:type="dxa"/>
+              <w:left w:w="80" w:type="dxa"/>
+              <w:right w:w="80" w:type="dxa"/>
+            </w:tcMar>
+            <w:shd w:val="clear" w:color="auto" w:fill="1F3864"/>
+          </w:tcPr>
+          <w:p>
+            <w:pPr>
+              <w:spacing w:before="40" w:after="40"/>
+            </w:pPr>
+            <w:r>
+              <w:rPr>
+                <w:rFonts w:ascii="Calibri" w:hAnsi="Calibri"/>
+                <w:b/>
+                <w:color w:val="FFFFFF"/>
+                <w:sz w:val="20"/>
+              </w:rPr>
+              <w:t xml:space="preserve">Data</w:t>
+            </w:r>
+          </w:p>
+        </w:tc>
+        <w:tc>
+          <w:tcPr>
+            <w:tcW w:type="dxa" w:w="1800"/>
+            <w:tcMar>
+              <w:top w:w="60" w:type="dxa"/>
+              <w:bottom w:w="60" w:type="dxa"/>
+              <w:left w:w="80" w:type="dxa"/>
+              <w:right w:w="80" w:type="dxa"/>
+            </w:tcMar>
+            <w:shd w:val="clear" w:color="auto" w:fill="1F3864"/>
+          </w:tcPr>
+          <w:p>
+            <w:pPr>
+              <w:spacing w:before="40" w:after="40"/>
+            </w:pPr>
+            <w:r>
+              <w:rPr>
+                <w:rFonts w:ascii="Calibri" w:hAnsi="Calibri"/>
+                <w:b/>
+                <w:color w:val="FFFFFF"/>
+                <w:sz w:val="20"/>
+              </w:rPr>
+              <w:t xml:space="preserve">Autor</w:t>
+            </w:r>
+          </w:p>
+        </w:tc>
+        <w:tc>
+          <w:tcPr>
+            <w:tcW w:type="dxa" w:w="4502"/>
+            <w:tcMar>
+              <w:top w:w="60" w:type="dxa"/>
+              <w:bottom w:w="60" w:type="dxa"/>
+              <w:left w:w="80" w:type="dxa"/>
+              <w:right w:w="80" w:type="dxa"/>
+            </w:tcMar>
+            <w:shd w:val="clear" w:color="auto" w:fill="1F3864"/>
+          </w:tcPr>
+          <w:p>
+            <w:pPr>
+              <w:spacing w:before="40" w:after="40"/>
+            </w:pPr>
+            <w:r>
+              <w:rPr>
+                <w:rFonts w:ascii="Calibri" w:hAnsi="Calibri"/>
+                <w:b/>
+                <w:color w:val="FFFFFF"/>
+                <w:sz w:val="20"/>
+              </w:rPr>
+              <w:t xml:space="preserve">Descrição</w:t>
+            </w:r>
+          </w:p>
+        </w:tc>
+      </w:tr>
       <w:tr>
         <w:trPr>
           <w:cantSplit w:val="1"/>
         </w:trPr>
         <w:tc>
           <w:tcPr>
-            <w:tcW w:type="dxa" w:w="2225"/>
+            <w:tcW w:type="dxa" w:w="1200"/>
             <w:tcMar>
               <w:top w:w="60" w:type="dxa"/>
               <w:bottom w:w="60" w:type="dxa"/>
-              <w:left w:w="100" w:type="dxa"/>
-              <w:right w:w="100" w:type="dxa"/>
+              <w:left w:w="80" w:type="dxa"/>
+              <w:right w:w="80" w:type="dxa"/>
             </w:tcMar>
             <w:shd w:val="clear" w:color="auto" w:fill="D6E4F0"/>
           </w:tcPr>
@@ -4202,22 +4001,21 @@
             <w:r>
               <w:rPr>
                 <w:rFonts w:ascii="Calibri" w:hAnsi="Calibri"/>
-                <w:b/>
-                <w:i w:val="0"/>
+                <w:b w:val="0"/>
                 <w:sz w:val="20"/>
               </w:rPr>
-              <w:t>Versão</w:t>
+              <w:t xml:space="preserve">1.0</w:t>
             </w:r>
           </w:p>
         </w:tc>
         <w:tc>
           <w:tcPr>
-            <w:tcW w:type="dxa" w:w="2225"/>
+            <w:tcW w:type="dxa" w:w="1400"/>
             <w:tcMar>
               <w:top w:w="60" w:type="dxa"/>
               <w:bottom w:w="60" w:type="dxa"/>
-              <w:left w:w="100" w:type="dxa"/>
-              <w:right w:w="100" w:type="dxa"/>
+              <w:left w:w="80" w:type="dxa"/>
+              <w:right w:w="80" w:type="dxa"/>
             </w:tcMar>
             <w:shd w:val="clear" w:color="auto" w:fill="D6E4F0"/>
           </w:tcPr>
@@ -4228,22 +4026,21 @@
             <w:r>
               <w:rPr>
                 <w:rFonts w:ascii="Calibri" w:hAnsi="Calibri"/>
-                <w:b/>
-                <w:i w:val="0"/>
+                <w:b w:val="0"/>
                 <w:sz w:val="20"/>
               </w:rPr>
-              <w:t>Data</w:t>
+              <w:t xml:space="preserve">15/06/2026</w:t>
             </w:r>
           </w:p>
         </w:tc>
         <w:tc>
           <w:tcPr>
-            <w:tcW w:type="dxa" w:w="2225"/>
+            <w:tcW w:type="dxa" w:w="1800"/>
             <w:tcMar>
               <w:top w:w="60" w:type="dxa"/>
               <w:bottom w:w="60" w:type="dxa"/>
-              <w:left w:w="100" w:type="dxa"/>
-              <w:right w:w="100" w:type="dxa"/>
+              <w:left w:w="80" w:type="dxa"/>
+              <w:right w:w="80" w:type="dxa"/>
             </w:tcMar>
             <w:shd w:val="clear" w:color="auto" w:fill="D6E4F0"/>
           </w:tcPr>
@@ -4254,22 +4051,21 @@
             <w:r>
               <w:rPr>
                 <w:rFonts w:ascii="Calibri" w:hAnsi="Calibri"/>
-                <w:b/>
-                <w:i w:val="0"/>
+                <w:b w:val="0"/>
                 <w:sz w:val="20"/>
               </w:rPr>
-              <w:t>Autor</w:t>
+              <w:t xml:space="preserve">Abraão Oliveira</w:t>
             </w:r>
           </w:p>
         </w:tc>
         <w:tc>
           <w:tcPr>
-            <w:tcW w:type="dxa" w:w="2225"/>
+            <w:tcW w:type="dxa" w:w="4502"/>
             <w:tcMar>
               <w:top w:w="60" w:type="dxa"/>
               <w:bottom w:w="60" w:type="dxa"/>
-              <w:left w:w="100" w:type="dxa"/>
-              <w:right w:w="100" w:type="dxa"/>
+              <w:left w:w="80" w:type="dxa"/>
+              <w:right w:w="80" w:type="dxa"/>
             </w:tcMar>
             <w:shd w:val="clear" w:color="auto" w:fill="D6E4F0"/>
           </w:tcPr>
@@ -4280,11 +4076,10 @@
             <w:r>
               <w:rPr>
                 <w:rFonts w:ascii="Calibri" w:hAnsi="Calibri"/>
-                <w:b/>
-                <w:i w:val="0"/>
+                <w:b w:val="0"/>
                 <w:sz w:val="20"/>
               </w:rPr>
-              <w:t>Descrição</w:t>
+              <w:t xml:space="preserve">Criação do índice de registros do projeto AASP01 (Sprint 2 em andamento)</w:t>
             </w:r>
           </w:p>
         </w:tc>
@@ -4295,38 +4090,12 @@
         </w:trPr>
         <w:tc>
           <w:tcPr>
-            <w:tcW w:type="dxa" w:w="2225"/>
+            <w:tcW w:type="dxa" w:w="1200"/>
             <w:tcMar>
               <w:top w:w="60" w:type="dxa"/>
               <w:bottom w:w="60" w:type="dxa"/>
-              <w:left w:w="100" w:type="dxa"/>
-              <w:right w:w="100" w:type="dxa"/>
-            </w:tcMar>
-            <w:shd w:val="clear" w:color="auto" w:fill="F0F4F8"/>
-          </w:tcPr>
-          <w:p>
-            <w:pPr>
-              <w:spacing w:before="40" w:after="40"/>
-            </w:pPr>
-            <w:r>
-              <w:rPr>
-                <w:rFonts w:ascii="Calibri" w:hAnsi="Calibri"/>
-                <w:b/>
-                <w:i w:val="0"/>
-                <w:sz w:val="20"/>
-              </w:rPr>
-              <w:t>1.0</w:t>
-            </w:r>
-          </w:p>
-        </w:tc>
-        <w:tc>
-          <w:tcPr>
-            <w:tcW w:type="dxa" w:w="2225"/>
-            <w:tcMar>
-              <w:top w:w="60" w:type="dxa"/>
-              <w:bottom w:w="60" w:type="dxa"/>
-              <w:left w:w="100" w:type="dxa"/>
-              <w:right w:w="100" w:type="dxa"/>
+              <w:left w:w="80" w:type="dxa"/>
+              <w:right w:w="80" w:type="dxa"/>
             </w:tcMar>
           </w:tcPr>
           <w:p>
@@ -4337,21 +4106,20 @@
               <w:rPr>
                 <w:rFonts w:ascii="Calibri" w:hAnsi="Calibri"/>
                 <w:b w:val="0"/>
-                <w:i w:val="0"/>
                 <w:sz w:val="20"/>
               </w:rPr>
-              <w:t>15/06/2026</w:t>
+              <w:t xml:space="preserve">1.1</w:t>
             </w:r>
           </w:p>
         </w:tc>
         <w:tc>
           <w:tcPr>
-            <w:tcW w:type="dxa" w:w="2225"/>
+            <w:tcW w:type="dxa" w:w="1400"/>
             <w:tcMar>
               <w:top w:w="60" w:type="dxa"/>
               <w:bottom w:w="60" w:type="dxa"/>
-              <w:left w:w="100" w:type="dxa"/>
-              <w:right w:w="100" w:type="dxa"/>
+              <w:left w:w="80" w:type="dxa"/>
+              <w:right w:w="80" w:type="dxa"/>
             </w:tcMar>
           </w:tcPr>
           <w:p>
@@ -4362,21 +4130,20 @@
               <w:rPr>
                 <w:rFonts w:ascii="Calibri" w:hAnsi="Calibri"/>
                 <w:b w:val="0"/>
-                <w:i w:val="0"/>
                 <w:sz w:val="20"/>
               </w:rPr>
-              <w:t>Abraão Oliveira</w:t>
+              <w:t xml:space="preserve">23/06/2026</w:t>
             </w:r>
           </w:p>
         </w:tc>
         <w:tc>
           <w:tcPr>
-            <w:tcW w:type="dxa" w:w="2225"/>
+            <w:tcW w:type="dxa" w:w="1800"/>
             <w:tcMar>
               <w:top w:w="60" w:type="dxa"/>
               <w:bottom w:w="60" w:type="dxa"/>
-              <w:left w:w="100" w:type="dxa"/>
-              <w:right w:w="100" w:type="dxa"/>
+              <w:left w:w="80" w:type="dxa"/>
+              <w:right w:w="80" w:type="dxa"/>
             </w:tcMar>
           </w:tcPr>
           <w:p>
@@ -4387,20 +4154,38 @@
               <w:rPr>
                 <w:rFonts w:ascii="Calibri" w:hAnsi="Calibri"/>
                 <w:b w:val="0"/>
-                <w:i w:val="0"/>
                 <w:sz w:val="20"/>
               </w:rPr>
-              <w:t>Criação do índice de registros do projeto AASP01 (Sprint 2 em andamento)</w:t>
+              <w:t xml:space="preserve">Abraão Oliveira</w:t>
+            </w:r>
+          </w:p>
+        </w:tc>
+        <w:tc>
+          <w:tcPr>
+            <w:tcW w:type="dxa" w:w="4502"/>
+            <w:tcMar>
+              <w:top w:w="60" w:type="dxa"/>
+              <w:bottom w:w="60" w:type="dxa"/>
+              <w:left w:w="80" w:type="dxa"/>
+              <w:right w:w="80" w:type="dxa"/>
+            </w:tcMar>
+          </w:tcPr>
+          <w:p>
+            <w:pPr>
+              <w:spacing w:before="40" w:after="40"/>
+            </w:pPr>
+            <w:r>
+              <w:rPr>
+                <w:rFonts w:ascii="Calibri" w:hAnsi="Calibri"/>
+                <w:b w:val="0"/>
+                <w:sz w:val="20"/>
+              </w:rPr>
+              <w:t xml:space="preserve">TAE e LI corrigidos de Sprint 4 para Sprint 3 (encerramento)</w:t>
             </w:r>
           </w:p>
         </w:tc>
       </w:tr>
     </w:tbl>
-    <w:p>
-      <w:pPr>
-        <w:spacing w:before="0" w:after="160"/>
-      </w:pPr>
-    </w:p>
     <w:sectPr>
       <w:headerReference w:type="default" r:id="rId9"/>
       <w:headerReference w:type="first" r:id="rId10"/>
@@ -4435,7 +4220,7 @@
         <w:color w:val="555555"/>
         <w:sz w:val="16"/>
       </w:rPr>
-      <w:t>v1.0  ·  15/06/2026</w:t>
+      <w:t>v1.1  ·  23/06/2026</w:t>
     </w:r>
     <w:r>
       <w:tab/>
@@ -4497,7 +4282,7 @@
         <w:color w:val="555555"/>
         <w:sz w:val="16"/>
       </w:rPr>
-      <w:t>v1.0  ·  15/06/2026</w:t>
+      <w:t>v1.1  ·  23/06/2026</w:t>
     </w:r>
     <w:r>
       <w:tab/>
@@ -4568,7 +4353,7 @@
         <w:color w:val="555555"/>
         <w:sz w:val="18"/>
       </w:rPr>
-      <w:t xml:space="preserve">   ·   AASP01</w:t>
+      <w:t xml:space="preserve">   ·   INDICE-AASP01</w:t>
     </w:r>
     <w:r>
       <w:tab/>
@@ -4579,7 +4364,7 @@
         <w:color w:val="555555"/>
         <w:sz w:val="18"/>
       </w:rPr>
-      <w:t>Evidência de Projeto</w:t>
+      <w:t>Controle de Documentação</w:t>
     </w:r>
   </w:p>
 </w:hdr>

</xml_diff>

<commit_message>
auditoria geral (Gerenciador/AASP01): reconcilia registros ao estado real do GitLab
- produto/repositorio: ms.auxo.gruposusuarios -> ms.auxo.usuarios
- framework: .NET 4.7.2 -> net5.0 (justificativa do Dapper reescrita no GDE)
- entregas Sprint 1: "merged em main" -> integradas em develop + baseline pela tag sprint-1-aceite
- politica de MR: 1 -> 2 revisores; QA: Leonardo F. Pereira -> Caroline Sousa
- versao/Data/historico atualizados nos .md e .docx (21+21 arquivos)
- novo: relatorio ALINHAMENTO_DOCS_x_GITLAB_AASP01_2026-06-25.md

Co-Authored-By: Claude Opus 4.8 <noreply@anthropic.com>
</commit_message>
<xml_diff>
--- a/mps-nivel-c/oficial/04_registros/AASP_Gerenciador/AASP01_Grupos-Usuarios/00_INDICE-AASP01_Mapa-de-Registros.docx
+++ b/mps-nivel-c/oficial/04_registros/AASP_Gerenciador/AASP01_Grupos-Usuarios/00_INDICE-AASP01_Mapa-de-Registros.docx
@@ -394,7 +394,7 @@
                 <w:i w:val="0"/>
                 <w:sz w:val="20"/>
               </w:rPr>
-              <w:t>ms.auxo.gruposusuarios</w:t>
+              <w:t>ms.auxo.usuarios</w:t>
             </w:r>
           </w:p>
         </w:tc>
@@ -440,17 +440,8 @@
             </w:tcMar>
           </w:tcPr>
           <w:p>
-            <w:pPr>
-              <w:spacing w:before="40" w:after="40"/>
-            </w:pPr>
             <w:r>
-              <w:rPr>
-                <w:rFonts w:ascii="Calibri" w:hAnsi="Calibri"/>
-                <w:b w:val="0"/>
-                <w:i w:val="0"/>
-                <w:sz w:val="20"/>
-              </w:rPr>
-              <w:t>1.0</w:t>
+              <w:t>1.1</w:t>
             </w:r>
           </w:p>
         </w:tc>
@@ -496,17 +487,8 @@
             </w:tcMar>
           </w:tcPr>
           <w:p>
-            <w:pPr>
-              <w:spacing w:before="40" w:after="40"/>
-            </w:pPr>
             <w:r>
-              <w:rPr>
-                <w:rFonts w:ascii="Calibri" w:hAnsi="Calibri"/>
-                <w:b w:val="0"/>
-                <w:i w:val="0"/>
-                <w:sz w:val="20"/>
-              </w:rPr>
-              <w:t>15/06/2026</w:t>
+              <w:t>24/06/2026</w:t>
             </w:r>
           </w:p>
         </w:tc>
@@ -4395,6 +4377,48 @@
           </w:p>
         </w:tc>
       </w:tr>
+      <w:tr>
+        <w:tc>
+          <w:tcPr>
+            <w:tcW w:type="dxa" w:w="2225"/>
+          </w:tcPr>
+          <w:p>
+            <w:r>
+              <w:t>1.1</w:t>
+            </w:r>
+          </w:p>
+        </w:tc>
+        <w:tc>
+          <w:tcPr>
+            <w:tcW w:type="dxa" w:w="2225"/>
+          </w:tcPr>
+          <w:p>
+            <w:r>
+              <w:t>24/06/2026</w:t>
+            </w:r>
+          </w:p>
+        </w:tc>
+        <w:tc>
+          <w:tcPr>
+            <w:tcW w:type="dxa" w:w="2225"/>
+          </w:tcPr>
+          <w:p>
+            <w:r>
+              <w:t>Time de Melhoria Contínua</w:t>
+            </w:r>
+          </w:p>
+        </w:tc>
+        <w:tc>
+          <w:tcPr>
+            <w:tcW w:type="dxa" w:w="2225"/>
+          </w:tcPr>
+          <w:p>
+            <w:r>
+              <w:t>Reconciliação com o estado real do GitLab (produto/repositório ms.auxo.usuarios; framework net5.0 onde aplicável; entregas da Sprint 1 integradas em develop com baseline pela tag sprint-1-aceite).</w:t>
+            </w:r>
+          </w:p>
+        </w:tc>
+      </w:tr>
     </w:tbl>
     <w:p>
       <w:pPr>

</xml_diff>

<commit_message>
auditoria geral (Gerenciador): correções do diagnóstico MPS-SW
- Sprint 4 -> Sprint 3 (INDICE, GQA) — projeto tem 3 sprints
- ADAP: corrige duplicata "Caroline (QA Timeware) + Caroline (QA AASP)" -> equipe de testes Timeware + Caroline (QA AASP)
- CAP/_DOSSIE/_PLANO: Azure DevOps/Pull Request -> GitLab/Merge Request (plataforma canônica)

Co-Authored-By: Claude Opus 4.8 <noreply@anthropic.com>
</commit_message>
<xml_diff>
--- a/mps-nivel-c/oficial/04_registros/AASP_Gerenciador/AASP01_Grupos-Usuarios/00_INDICE-AASP01_Mapa-de-Registros.docx
+++ b/mps-nivel-c/oficial/04_registros/AASP_Gerenciador/AASP01_Grupos-Usuarios/00_INDICE-AASP01_Mapa-de-Registros.docx
@@ -728,7 +728,7 @@
           <w:i w:val="0"/>
           <w:sz w:val="22"/>
         </w:rPr>
-        <w:t xml:space="preserve"> Abertura, Discovery/Requisitos, Concepção e Planejamento concluídas; Desenvolvimento em curso; Homologação e Encerramento previstos para a Sprint 4.</w:t>
+        <w:t xml:space="preserve"> Abertura, Discovery/Requisitos, Concepção e Planejamento concluídas; Desenvolvimento em curso; Homologação e Encerramento previstos para a Sprint 3.</w:t>
       </w:r>
     </w:p>
     <w:p>
@@ -3837,7 +3837,7 @@
                 <w:i w:val="0"/>
                 <w:sz w:val="20"/>
               </w:rPr>
-              <w:t>⏳ Sprint 4</w:t>
+              <w:t>⏳ Sprint 3</w:t>
             </w:r>
           </w:p>
         </w:tc>
@@ -3972,7 +3972,7 @@
                 <w:i w:val="0"/>
                 <w:sz w:val="20"/>
               </w:rPr>
-              <w:t>⏳ Sprint 4</w:t>
+              <w:t>⏳ Sprint 3</w:t>
             </w:r>
           </w:p>
         </w:tc>

</xml_diff>